<commit_message>
Sync desde Desktop: Parte 5 + Prologo + Indice de Arcos + URLs limpias
- Nueva Parte 5 completa: contenido, portadas, arcos 1-3,
  downloads (PDF/DOCX), parte5.runtime.js.
- Sistema de arcos y prologo integrado en app.js (PART5_ARCS,
  PART5_SECTIONS, indexBackdropAssets, etc).
- vercel.json con rewrites para /, /inicio, /biblioteca,
  /indice, /indice/:part, /indice/:part/:arc, /leer/:chapter,
  /leer/:chapter/:target (URLs sin index.html#).
- Stubs de app/page.tsx (Next.js) eliminados: el routing vive
  en vercel.json y app.js.
- Asset huérfano parte-v-general-cover.webp removido (sin
  referencia en runtime ni en html).
- AUDITORIA_DEPURACION.md y notas internas se mantienen
  fuera del repo.
</commit_message>
<xml_diff>
--- a/downloads/Sahlo-Folina-Parte-IV.docx
+++ b/downloads/Sahlo-Folina-Parte-IV.docx
@@ -22,7 +22,7 @@
           <wp:inline distT="0" distB="0" distL="0" distR="0" wp14:anchorId="4EF65300" wp14:editId="5ADB0256">
             <wp:extent cx="5486400" cy="8229600"/>
             <wp:effectExtent l="0" t="0" r="0" b="0"/>
-            <wp:docPr id="1" name="Picture 1"/>
+            <wp:docPr id="1" name="Picture 1" descr="Ilustración de portada de Sahlo Folina, Parte IV: Los que se quedaron." title="Portada de la Parte IV"/>
             <wp:cNvGraphicFramePr>
               <a:graphicFrameLocks xmlns:a="http://schemas.openxmlformats.org/drawingml/2006/main" noChangeAspect="1"/>
             </wp:cNvGraphicFramePr>
@@ -117,7 +117,7 @@
         </w:rPr>
       </w:pPr>
       <w:r>
-        <w:t>Mara, James, Elias, Bram, la estatua de los brazos levantados y la red interior conservan la continuidad establecida en las Partes I, II y III. Esta obra fan no es oficial y se realiza como homenaje al universo narrativo de Twenty One Pilots.</w:t>
+        <w:t>Mara, James, Elias, Bram, la estatua de los brazos levantados y la red interior conservan la continuidad establecida en las Partes I, II y en la edición final canónica de la Parte III. Esta obra fan no es oficial y se realiza como homenaje al universo narrativo de Twenty One Pilots.</w:t>
       </w:r>
     </w:p>
     <w:p>
@@ -4926,35 +4926,35 @@
         <w:rPr>
           <w:lang w:val="es-NI"/>
         </w:rPr>
-        <w:t>Después se detenía.</w:t>
-      </w:r>
-    </w:p>
-    <w:p>
-      <w:pPr>
-        <w:pStyle w:val="NovelBody"/>
-        <w:rPr>
-          <w:lang w:val="es-NI"/>
-        </w:rPr>
-      </w:pPr>
-      <w:r>
-        <w:rPr>
-          <w:lang w:val="es-NI"/>
-        </w:rPr>
-        <w:t>Luego regresaba varios kilómetros al oeste, arrastrado por una corriente distinta.</w:t>
-      </w:r>
-    </w:p>
-    <w:p>
-      <w:pPr>
-        <w:pStyle w:val="NovelBody"/>
-        <w:rPr>
-          <w:lang w:val="es-NI"/>
-        </w:rPr>
-      </w:pPr>
-      <w:r>
-        <w:rPr>
-          <w:lang w:val="es-NI"/>
-        </w:rPr>
-        <w:t>Eso significaba que alguien había movido el transmisor o que el objeto que lo contenía había tocado tierra antes de volver al agua.</w:t>
+        <w:t>Después se detenía cerca de una franja de roca negra.</w:t>
+      </w:r>
+    </w:p>
+    <w:p>
+      <w:pPr>
+        <w:pStyle w:val="NovelBody"/>
+        <w:rPr>
+          <w:lang w:val="es-NI"/>
+        </w:rPr>
+      </w:pPr>
+      <w:r>
+        <w:rPr>
+          <w:lang w:val="es-NI"/>
+        </w:rPr>
+        <w:t>Durante las horas siguientes reaparecía dentro de un radio corto, como si la marea o la imprecisión de la triangulación desplazaran la señal entre las mismas rocas.</w:t>
+      </w:r>
+    </w:p>
+    <w:p>
+      <w:pPr>
+        <w:pStyle w:val="NovelBody"/>
+        <w:rPr>
+          <w:lang w:val="es-NI"/>
+        </w:rPr>
+      </w:pPr>
+      <w:r>
+        <w:rPr>
+          <w:lang w:val="es-NI"/>
+        </w:rPr>
+        <w:t>Eso significaba que el transmisor había alcanzado tierra o permanecía a pocos metros de ella. No bastaba para saber si alguien había asegurado el panel, si el oleaje lo movía o si la señal rebotaba contra la piedra.</w:t>
       </w:r>
     </w:p>
     <w:p>
@@ -5490,7 +5490,7 @@
         <w:pStyle w:val="NovelBody"/>
       </w:pPr>
       <w:r>
-        <w:t>RUTA A — PANEL DE EMERGENCIA. Señal intermitente hacia el este, contacto probable con roca negra y regreso posterior hacia el oeste. El transmisor permanecía unido al panel por el cable, aunque el micrófono había sido arrancado de su soporte.</w:t>
+        <w:t>RUTA A — PANEL DE EMERGENCIA. Señal intermitente hacia el este, contacto probable con roca negra y permanencia dentro de una cala. El transmisor continuaba unido al panel por el cable, aunque el micrófono había sido arrancado de su soporte.</w:t>
       </w:r>
     </w:p>
     <w:p>
@@ -6500,46 +6500,46 @@
         </w:rPr>
       </w:pPr>
       <w:r>
-        <w:t>—No Chances detectó el transmisor cuando el panel volvió hacia el oeste. Una patrulla encontró al pasajero sujeto al metal. El micrófono faltaba de su soporte, pero el cable seguía conectado a la carcasa y la baliza emitía pulsos intermitentes.</w:t>
-      </w:r>
-    </w:p>
-    <w:p>
-      <w:pPr>
-        <w:pStyle w:val="NovelBody"/>
-        <w:rPr>
-          <w:lang w:val="es-NI"/>
-        </w:rPr>
-      </w:pPr>
-      <w:r>
-        <w:t>—¿Por qué el panel volvió al agua después de tocar tierra?</w:t>
-      </w:r>
-    </w:p>
-    <w:p>
-      <w:pPr>
-        <w:pStyle w:val="NovelBody"/>
-        <w:rPr>
-          <w:lang w:val="es-NI"/>
-        </w:rPr>
-      </w:pPr>
-      <w:r>
-        <w:rPr>
-          <w:lang w:val="es-NI"/>
-        </w:rPr>
-        <w:t>—El informe no lo explica.</w:t>
-      </w:r>
-    </w:p>
-    <w:p>
-      <w:pPr>
-        <w:pStyle w:val="NovelBody"/>
-        <w:rPr>
-          <w:lang w:val="es-NI"/>
-        </w:rPr>
-      </w:pPr>
-      <w:r>
-        <w:rPr>
-          <w:lang w:val="es-NI"/>
-        </w:rPr>
-        <w:t>Mara imaginó a Clancy frente a luces de búsqueda, con un hombre inconsciente y una isla que no conocía. Si una patrulla se acercaba, conservar al testigo en la costa podía revelar la ubicación. Devolverlo al agua podía matarlo.</w:t>
+        <w:t>—No Chances trianguló los pulsos dentro de una cala de roca negra. La patrulla encontró al pasajero en tierra, cubierto por una lona, con una botella cerrada a su lado y el panel asegurado entre dos piedras. El micrófono faltaba de su soporte, pero el cable seguía conectado a la carcasa y la baliza continuaba emitiendo.</w:t>
+      </w:r>
+    </w:p>
+    <w:p>
+      <w:pPr>
+        <w:pStyle w:val="NovelBody"/>
+        <w:rPr>
+          <w:lang w:val="es-NI"/>
+        </w:rPr>
+      </w:pPr>
+      <w:r>
+        <w:t>—¿Clancy lo dejó así?</w:t>
+      </w:r>
+    </w:p>
+    <w:p>
+      <w:pPr>
+        <w:pStyle w:val="NovelBody"/>
+        <w:rPr>
+          <w:lang w:val="es-NI"/>
+        </w:rPr>
+      </w:pPr>
+      <w:r>
+        <w:rPr>
+          <w:lang w:val="es-NI"/>
+        </w:rPr>
+        <w:t>—Eso indica la escena. El informe no registra cuánto tiempo permaneció allí ni si vio aproximarse a la patrulla.</w:t>
+      </w:r>
+    </w:p>
+    <w:p>
+      <w:pPr>
+        <w:pStyle w:val="NovelBody"/>
+        <w:rPr>
+          <w:lang w:val="es-NI"/>
+        </w:rPr>
+      </w:pPr>
+      <w:r>
+        <w:rPr>
+          <w:lang w:val="es-NI"/>
+        </w:rPr>
+        <w:t>Mara imaginó a Clancy frente a una costa desconocida, con un hombre inconsciente y una baliza que podía atraer ayuda o entregar su posición. Dejar agua, una lona y el transmisor significaba confiar la vida del pasajero a la misma ciudad de la que intentaba escapar.</w:t>
       </w:r>
     </w:p>
     <w:p>
@@ -6567,7 +6567,7 @@
         <w:rPr>
           <w:lang w:val="es-NI"/>
         </w:rPr>
-        <w:t>—Clancy lo empujó hacia la corriente —dijo.</w:t>
+        <w:t>—Esperó a comprobar que la señal seguía activa —dijo Mara.</w:t>
       </w:r>
     </w:p>
     <w:p>
@@ -6595,21 +6595,21 @@
         <w:rPr>
           <w:lang w:val="es-NI"/>
         </w:rPr>
-        <w:t>—Para que lo encontraran sin llegar a la isla.</w:t>
-      </w:r>
-    </w:p>
-    <w:p>
-      <w:pPr>
-        <w:pStyle w:val="NovelBody"/>
-        <w:rPr>
-          <w:lang w:val="es-NI"/>
-        </w:rPr>
-      </w:pPr>
-      <w:r>
-        <w:rPr>
-          <w:lang w:val="es-NI"/>
-        </w:rPr>
-        <w:t>—También es posible que el panel se soltara.</w:t>
+        <w:t>—Y se marchó antes de que llegaran las luces.</w:t>
+      </w:r>
+    </w:p>
+    <w:p>
+      <w:pPr>
+        <w:pStyle w:val="NovelBody"/>
+        <w:rPr>
+          <w:lang w:val="es-NI"/>
+        </w:rPr>
+      </w:pPr>
+      <w:r>
+        <w:rPr>
+          <w:lang w:val="es-NI"/>
+        </w:rPr>
+        <w:t>—También es posible que nunca las viera.</w:t>
       </w:r>
     </w:p>
     <w:p>
@@ -6844,25 +6844,13 @@
           <w:lang w:val="es-NI"/>
         </w:rPr>
       </w:pPr>
-      <w:r>
-        <w:rPr>
-          <w:lang w:val="es-NI"/>
-        </w:rPr>
-        <w:t xml:space="preserve">—¿Era el líder Bandito conocido como </w:t>
-      </w:r>
       <w:proofErr w:type="spellStart"/>
-      <w:r>
-        <w:rPr>
-          <w:lang w:val="es-NI"/>
-        </w:rPr>
-        <w:t>Torchbearer</w:t>
-      </w:r>
       <w:proofErr w:type="spellEnd"/>
       <w:r>
         <w:rPr>
           <w:lang w:val="es-NI"/>
         </w:rPr>
-        <w:t>?</w:t>
+        <w:t>—¿Era el líder Bandito conocido como el Portador de la Antorcha?</w:t>
       </w:r>
     </w:p>
     <w:p>
@@ -7003,51 +6991,27 @@
         <w:rPr>
           <w:lang w:val="es-NI"/>
         </w:rPr>
-        <w:t>No eran versiones necesariamente incompatibles. Podían pertenecer a momentos distintos. El técnico podía haberse separado. La presencia de la costa podía ser una alucinación. O una forma de guía que no ocupaba un cuerpo.</w:t>
-      </w:r>
-    </w:p>
-    <w:p>
-      <w:pPr>
-        <w:pStyle w:val="NovelBody"/>
-        <w:rPr>
-          <w:lang w:val="es-NI"/>
-        </w:rPr>
-      </w:pPr>
-      <w:r>
-        <w:rPr>
-          <w:lang w:val="es-NI"/>
-        </w:rPr>
-        <w:t xml:space="preserve">Mara pensó en el </w:t>
-      </w:r>
+        <w:t>No eran versiones necesariamente incompatibles. Podían pertenecer a momentos distintos. El técnico podía haberse separado. La presencia de la costa podía ser una alucinación, una memoria superpuesta o una dirección que Clancy había traducido en una figura conocida.</w:t>
+      </w:r>
+    </w:p>
+    <w:p>
+      <w:pPr>
+        <w:pStyle w:val="NovelBody"/>
+        <w:rPr>
+          <w:lang w:val="es-NI"/>
+        </w:rPr>
+      </w:pPr>
       <w:proofErr w:type="spellStart"/>
-      <w:r>
-        <w:rPr>
-          <w:lang w:val="es-NI"/>
-        </w:rPr>
-        <w:t>Livestream</w:t>
-      </w:r>
       <w:proofErr w:type="spellEnd"/>
-      <w:r>
-        <w:rPr>
-          <w:lang w:val="es-NI"/>
-        </w:rPr>
-        <w:t xml:space="preserve">. En la figura sobre la plataforma, rodeada de niebla, que había golpeado el código de James. Clancy había pronunciado el nombre de </w:t>
-      </w:r>
       <w:proofErr w:type="spellStart"/>
       <w:proofErr w:type="gramStart"/>
-      <w:r>
-        <w:rPr>
-          <w:lang w:val="es-NI"/>
-        </w:rPr>
-        <w:t>Torchbearer</w:t>
-      </w:r>
       <w:proofErr w:type="spellEnd"/>
       <w:proofErr w:type="gramEnd"/>
       <w:r>
         <w:rPr>
           <w:lang w:val="es-NI"/>
         </w:rPr>
-        <w:t xml:space="preserve"> aunque nadie había confirmado quién estaba allí.</w:t>
+        <w:t>Mara pensó en el Livestream. En la figura sobre la plataforma, rodeada de niebla, que había golpeado el código de James. Clancy había pronunciado el nombre del Portador aunque nadie había confirmado quién estaba allí.</w:t>
       </w:r>
     </w:p>
     <w:p>
@@ -7085,25 +7049,13 @@
           <w:lang w:val="es-NI"/>
         </w:rPr>
       </w:pPr>
-      <w:r>
-        <w:rPr>
-          <w:lang w:val="es-NI"/>
-        </w:rPr>
-        <w:t>—¿</w:t>
-      </w:r>
       <w:proofErr w:type="spellStart"/>
-      <w:r>
-        <w:rPr>
-          <w:lang w:val="es-NI"/>
-        </w:rPr>
-        <w:t>Torchbearer</w:t>
-      </w:r>
       <w:proofErr w:type="spellEnd"/>
       <w:r>
         <w:rPr>
           <w:lang w:val="es-NI"/>
         </w:rPr>
-        <w:t>?</w:t>
+        <w:t>—¿El Portador?</w:t>
       </w:r>
     </w:p>
     <w:p>
@@ -7225,25 +7177,13 @@
           <w:lang w:val="es-NI"/>
         </w:rPr>
       </w:pPr>
-      <w:r>
-        <w:rPr>
-          <w:lang w:val="es-NI"/>
-        </w:rPr>
-        <w:t xml:space="preserve">—Clancy vio a </w:t>
-      </w:r>
       <w:proofErr w:type="spellStart"/>
-      <w:r>
-        <w:rPr>
-          <w:lang w:val="es-NI"/>
-        </w:rPr>
-        <w:t>Torchbearer</w:t>
-      </w:r>
       <w:proofErr w:type="spellEnd"/>
       <w:r>
         <w:rPr>
           <w:lang w:val="es-NI"/>
         </w:rPr>
-        <w:t>.</w:t>
+        <w:t>—Clancy vio al Portador.</w:t>
       </w:r>
     </w:p>
     <w:p>
@@ -16631,25 +16571,13 @@
           <w:lang w:val="es-NI"/>
         </w:rPr>
       </w:pPr>
-      <w:r>
-        <w:rPr>
-          <w:lang w:val="es-NI"/>
-        </w:rPr>
-        <w:t xml:space="preserve">James la había preparado en una cisterna abandonada cerca del perímetro oriental. La ruta no conectaba directamente con la estatua ni con ninguna célula activa. </w:t>
-      </w:r>
       <w:proofErr w:type="spellStart"/>
-      <w:r>
-        <w:rPr>
-          <w:lang w:val="es-NI"/>
-        </w:rPr>
-        <w:t>Torchbearer</w:t>
-      </w:r>
       <w:proofErr w:type="spellEnd"/>
       <w:r>
         <w:rPr>
           <w:lang w:val="es-NI"/>
         </w:rPr>
-        <w:t xml:space="preserve"> conocía solo el punto de entrada. Mara y James llegaron por caminos separados.</w:t>
+        <w:t>James la había preparado en una cisterna abandonada cerca del perímetro oriental. La ruta no conectaba directamente con la estatua ni con ninguna célula activa. El Portador conocía solo el punto de entrada. Mara y James llegaron por caminos separados.</w:t>
       </w:r>
     </w:p>
     <w:p>
@@ -16717,18 +16645,12 @@
         </w:rPr>
       </w:pPr>
       <w:proofErr w:type="spellStart"/>
-      <w:r>
-        <w:rPr>
-          <w:lang w:val="es-NI"/>
-        </w:rPr>
-        <w:t>Torchbearer</w:t>
-      </w:r>
       <w:proofErr w:type="spellEnd"/>
       <w:r>
         <w:rPr>
           <w:lang w:val="es-NI"/>
         </w:rPr>
-        <w:t xml:space="preserve"> dejó la mochila en el suelo.</w:t>
+        <w:t>El Portador dejó la mochila en el suelo.</w:t>
       </w:r>
     </w:p>
     <w:p>
@@ -16808,25 +16730,13 @@
           <w:lang w:val="es-NI"/>
         </w:rPr>
       </w:pPr>
-      <w:r>
-        <w:rPr>
-          <w:lang w:val="es-NI"/>
-        </w:rPr>
-        <w:t xml:space="preserve">Clancy había visto a </w:t>
-      </w:r>
       <w:proofErr w:type="spellStart"/>
-      <w:r>
-        <w:rPr>
-          <w:lang w:val="es-NI"/>
-        </w:rPr>
-        <w:t>Torchbearer</w:t>
-      </w:r>
       <w:proofErr w:type="spellEnd"/>
       <w:r>
         <w:rPr>
           <w:lang w:val="es-NI"/>
         </w:rPr>
-        <w:t xml:space="preserve"> dentro del submarino.</w:t>
+        <w:t>Clancy había afirmado ver al Portador dentro del submarino.</w:t>
       </w:r>
     </w:p>
     <w:p>
@@ -16893,18 +16803,12 @@
         </w:rPr>
       </w:pPr>
       <w:proofErr w:type="spellStart"/>
-      <w:r>
-        <w:rPr>
-          <w:lang w:val="es-NI"/>
-        </w:rPr>
-        <w:t>Torchbearer</w:t>
-      </w:r>
       <w:proofErr w:type="spellEnd"/>
       <w:r>
         <w:rPr>
           <w:lang w:val="es-NI"/>
         </w:rPr>
-        <w:t xml:space="preserve"> lo hizo.</w:t>
+        <w:t>El Portador lo hizo.</w:t>
       </w:r>
     </w:p>
     <w:p>
@@ -17039,18 +16943,12 @@
         </w:rPr>
       </w:pPr>
       <w:proofErr w:type="spellStart"/>
-      <w:r>
-        <w:rPr>
-          <w:lang w:val="es-NI"/>
-        </w:rPr>
-        <w:t>Torchbearer</w:t>
-      </w:r>
       <w:proofErr w:type="spellEnd"/>
       <w:r>
         <w:rPr>
           <w:lang w:val="es-NI"/>
         </w:rPr>
-        <w:t xml:space="preserve"> miró la mochila.</w:t>
+        <w:t>El Portador miró la mochila.</w:t>
       </w:r>
     </w:p>
     <w:p>
@@ -17091,7 +16989,7 @@
       <w:proofErr w:type="spellStart"/>
       <w:proofErr w:type="spellEnd"/>
       <w:r>
-        <w:t>Aun así, señaló los objetos extendidos sobre una tela: la chaqueta oscura que Torchbearer entregó a Clancy, con una cinta cosida por dentro, y el mapa de Bram con una esquina quemada.</w:t>
+        <w:t>Aun así, señaló los objetos extendidos sobre una tela: la chaqueta oscura que el Portador entregó a Clancy, con una cinta cosida por dentro, y el mapa de Bram con una esquina quemada.</w:t>
       </w:r>
     </w:p>
     <w:p>
@@ -17102,18 +17000,12 @@
         </w:rPr>
       </w:pPr>
       <w:proofErr w:type="spellStart"/>
-      <w:r>
-        <w:rPr>
-          <w:lang w:val="es-NI"/>
-        </w:rPr>
-        <w:t>Torchbearer</w:t>
-      </w:r>
       <w:proofErr w:type="spellEnd"/>
       <w:r>
         <w:rPr>
           <w:lang w:val="es-NI"/>
         </w:rPr>
-        <w:t xml:space="preserve"> tocó la costura.</w:t>
+        <w:t>El Portador tocó la costura.</w:t>
       </w:r>
     </w:p>
     <w:p>
@@ -17236,32 +17128,26 @@
         </w:rPr>
       </w:pPr>
       <w:proofErr w:type="spellStart"/>
-      <w:r>
-        <w:rPr>
-          <w:lang w:val="es-NI"/>
-        </w:rPr>
-        <w:t>Torchbearer</w:t>
-      </w:r>
       <w:proofErr w:type="spellEnd"/>
       <w:r>
         <w:rPr>
           <w:lang w:val="es-NI"/>
         </w:rPr>
-        <w:t xml:space="preserve"> la miró sin comprender.</w:t>
-      </w:r>
-    </w:p>
-    <w:p>
-      <w:pPr>
-        <w:pStyle w:val="NovelBody"/>
-        <w:rPr>
-          <w:lang w:val="es-NI"/>
-        </w:rPr>
-      </w:pPr>
-      <w:r>
-        <w:rPr>
-          <w:lang w:val="es-NI"/>
-        </w:rPr>
-        <w:t>—No estuve en el submarino.</w:t>
+        <w:t>El Portador la miró sin comprender.</w:t>
+      </w:r>
+    </w:p>
+    <w:p>
+      <w:pPr>
+        <w:pStyle w:val="NovelBody"/>
+        <w:rPr>
+          <w:lang w:val="es-NI"/>
+        </w:rPr>
+      </w:pPr>
+      <w:r>
+        <w:rPr>
+          <w:lang w:val="es-NI"/>
+        </w:rPr>
+        <w:t>—No sé cómo responder eso.</w:t>
       </w:r>
     </w:p>
     <w:p>
@@ -17303,7 +17189,7 @@
         <w:rPr>
           <w:lang w:val="es-NI"/>
         </w:rPr>
-        <w:t>—No.</w:t>
+        <w:t>—O creyó verme.</w:t>
       </w:r>
     </w:p>
     <w:p>
@@ -17331,8 +17217,7 @@
         <w:rPr>
           <w:lang w:val="es-NI"/>
         </w:rPr>
-        <w:lastRenderedPageBreak/>
-        <w:t>—No físicamente.</w:t>
+        <w:t>—Eso es lo que describe.</w:t>
       </w:r>
     </w:p>
     <w:p>
@@ -17357,32 +17242,26 @@
         </w:rPr>
       </w:pPr>
       <w:proofErr w:type="spellStart"/>
-      <w:r>
-        <w:rPr>
-          <w:lang w:val="es-NI"/>
-        </w:rPr>
-        <w:t>Torchbearer</w:t>
-      </w:r>
       <w:proofErr w:type="spellEnd"/>
       <w:r>
         <w:rPr>
           <w:lang w:val="es-NI"/>
         </w:rPr>
-        <w:t xml:space="preserve"> volvió la vista hacia James, como si esperara una explicación que tampoco él poseía.</w:t>
-      </w:r>
-    </w:p>
-    <w:p>
-      <w:pPr>
-        <w:pStyle w:val="NovelBody"/>
-        <w:rPr>
-          <w:lang w:val="es-NI"/>
-        </w:rPr>
-      </w:pPr>
-      <w:r>
-        <w:rPr>
-          <w:lang w:val="es-NI"/>
-        </w:rPr>
-        <w:t>—Durante Saturday yo estaba en Trench —dijo—. Lena puede confirmarlo. Trece personas pueden hacerlo. Seguíamos la señal del puerto desde el campamento.</w:t>
+        <w:t>El Portador volvió la vista hacia James, como si esperara una explicación que tampoco él poseía.</w:t>
+      </w:r>
+    </w:p>
+    <w:p>
+      <w:pPr>
+        <w:pStyle w:val="NovelBody"/>
+        <w:rPr>
+          <w:lang w:val="es-NI"/>
+        </w:rPr>
+      </w:pPr>
+      <w:r>
+        <w:rPr>
+          <w:lang w:val="es-NI"/>
+        </w:rPr>
+        <w:t>—Mi última ubicación verificable antes del naufragio estaba en Trench —dijo—. Seguíamos la señal del puerto desde el campamento. Después tengo fragmentos: agua, una dirección y la certeza de que Clancy estaba decidiendo algo. No puedo demostrar que esos fragmentos pertenezcan a mis ojos.</w:t>
       </w:r>
     </w:p>
     <w:p>
@@ -17424,7 +17303,7 @@
         <w:rPr>
           <w:lang w:val="es-NI"/>
         </w:rPr>
-        <w:t>De la persona que Clancy había visto con su rostro.</w:t>
+        <w:t>De la posibilidad de que una dirección hubiera utilizado su rostro sin entregar una explicación completa.</w:t>
       </w:r>
     </w:p>
     <w:p>
@@ -17462,25 +17341,13 @@
           <w:lang w:val="es-NI"/>
         </w:rPr>
       </w:pPr>
-      <w:r>
-        <w:rPr>
-          <w:lang w:val="es-NI"/>
-        </w:rPr>
-        <w:t xml:space="preserve">Hizo que una cámara del norte enviara una imagen antigua de </w:t>
-      </w:r>
       <w:proofErr w:type="spellStart"/>
-      <w:r>
-        <w:rPr>
-          <w:lang w:val="es-NI"/>
-        </w:rPr>
-        <w:t>Torchbearer</w:t>
-      </w:r>
       <w:proofErr w:type="spellEnd"/>
       <w:r>
         <w:rPr>
           <w:lang w:val="es-NI"/>
         </w:rPr>
-        <w:t>. Activó una compuerta al sur con la credencial inválida de Port Vial y provocó una falla de luz en el oeste. No Chances dividió el cerco en tres equipos.</w:t>
+        <w:t>Hizo que una cámara del norte enviara una imagen antigua del Portador. Activó una compuerta al sur con la credencial inválida de Port Vial y provocó una falla de luz en el oeste. No Chances dividió el cerco en tres equipos.</w:t>
       </w:r>
     </w:p>
     <w:p>
@@ -17504,25 +17371,13 @@
           <w:lang w:val="es-NI"/>
         </w:rPr>
       </w:pPr>
-      <w:r>
-        <w:rPr>
-          <w:lang w:val="es-NI"/>
-        </w:rPr>
-        <w:t xml:space="preserve">—Acabas de aumentar el tiempo —observó </w:t>
-      </w:r>
       <w:proofErr w:type="spellStart"/>
-      <w:r>
-        <w:rPr>
-          <w:lang w:val="es-NI"/>
-        </w:rPr>
-        <w:t>Torchbearer</w:t>
-      </w:r>
       <w:proofErr w:type="spellEnd"/>
       <w:r>
         <w:rPr>
           <w:lang w:val="es-NI"/>
         </w:rPr>
-        <w:t>.</w:t>
+        <w:t>—Acabas de aumentar el tiempo —observó el Portador.</w:t>
       </w:r>
     </w:p>
     <w:p>
@@ -17589,32 +17444,26 @@
         </w:rPr>
       </w:pPr>
       <w:proofErr w:type="spellStart"/>
-      <w:r>
-        <w:rPr>
-          <w:lang w:val="es-NI"/>
-        </w:rPr>
-        <w:t>Torchbearer</w:t>
-      </w:r>
       <w:proofErr w:type="spellEnd"/>
       <w:r>
         <w:rPr>
           <w:lang w:val="es-NI"/>
         </w:rPr>
-        <w:t xml:space="preserve"> se sentó sobre una caja de piedra.</w:t>
-      </w:r>
-    </w:p>
-    <w:p>
-      <w:pPr>
-        <w:pStyle w:val="NovelBody"/>
-        <w:rPr>
-          <w:lang w:val="es-NI"/>
-        </w:rPr>
-      </w:pPr>
-      <w:r>
-        <w:rPr>
-          <w:lang w:val="es-NI"/>
-        </w:rPr>
-        <w:t>—Bram.</w:t>
+        <w:t>El Portador se sentó sobre una caja de piedra.</w:t>
+      </w:r>
+    </w:p>
+    <w:p>
+      <w:pPr>
+        <w:pStyle w:val="NovelBody"/>
+        <w:rPr>
+          <w:lang w:val="es-NI"/>
+        </w:rPr>
+      </w:pPr>
+      <w:r>
+        <w:rPr>
+          <w:lang w:val="es-NI"/>
+        </w:rPr>
+        <w:t>—Bram fue el primero en responder al código.</w:t>
       </w:r>
     </w:p>
     <w:p>
@@ -17780,18 +17629,12 @@
         </w:rPr>
       </w:pPr>
       <w:proofErr w:type="spellStart"/>
-      <w:r>
-        <w:rPr>
-          <w:lang w:val="es-NI"/>
-        </w:rPr>
-        <w:t>Torchbearer</w:t>
-      </w:r>
       <w:proofErr w:type="spellEnd"/>
       <w:r>
         <w:rPr>
           <w:lang w:val="es-NI"/>
         </w:rPr>
-        <w:t xml:space="preserve"> la reconoció.</w:t>
+        <w:t>El Portador la reconoció.</w:t>
       </w:r>
     </w:p>
     <w:p>
@@ -17830,32 +17673,26 @@
         </w:rPr>
       </w:pPr>
       <w:proofErr w:type="spellStart"/>
-      <w:r>
-        <w:rPr>
-          <w:lang w:val="es-NI"/>
-        </w:rPr>
-        <w:t>Torchbearer</w:t>
-      </w:r>
       <w:proofErr w:type="spellEnd"/>
       <w:r>
         <w:rPr>
           <w:lang w:val="es-NI"/>
         </w:rPr>
-        <w:t xml:space="preserve"> cerró los ojos un instante.</w:t>
-      </w:r>
-    </w:p>
-    <w:p>
-      <w:pPr>
-        <w:pStyle w:val="NovelBody"/>
-        <w:rPr>
-          <w:lang w:val="es-NI"/>
-        </w:rPr>
-      </w:pPr>
-      <w:r>
-        <w:rPr>
-          <w:lang w:val="es-NI"/>
-        </w:rPr>
-        <w:t>—Entonces llegó más lejos de lo que sabíamos.</w:t>
+        <w:t>El Portador cerró los ojos un instante.</w:t>
+      </w:r>
+    </w:p>
+    <w:p>
+      <w:pPr>
+        <w:pStyle w:val="NovelBody"/>
+        <w:rPr>
+          <w:lang w:val="es-NI"/>
+        </w:rPr>
+      </w:pPr>
+      <w:r>
+        <w:rPr>
+          <w:lang w:val="es-NI"/>
+        </w:rPr>
+        <w:t>—Entonces la señal asociada con él llegó más lejos de lo que sabíamos.</w:t>
       </w:r>
     </w:p>
     <w:p>
@@ -17894,32 +17731,26 @@
         </w:rPr>
       </w:pPr>
       <w:proofErr w:type="spellStart"/>
-      <w:r>
-        <w:rPr>
-          <w:lang w:val="es-NI"/>
-        </w:rPr>
-        <w:t>Torchbearer</w:t>
-      </w:r>
       <w:proofErr w:type="spellEnd"/>
       <w:r>
         <w:rPr>
           <w:lang w:val="es-NI"/>
         </w:rPr>
-        <w:t xml:space="preserve"> apoyó las manos sobre las rodillas.</w:t>
-      </w:r>
-    </w:p>
-    <w:p>
-      <w:pPr>
-        <w:pStyle w:val="NovelBody"/>
-        <w:rPr>
-          <w:lang w:val="es-NI"/>
-        </w:rPr>
-      </w:pPr>
-      <w:r>
-        <w:rPr>
-          <w:lang w:val="es-NI"/>
-        </w:rPr>
-        <w:t>—A veces puedo mantener una dirección para él.</w:t>
+        <w:t>El Portador apoyó las manos sobre las rodillas.</w:t>
+      </w:r>
+    </w:p>
+    <w:p>
+      <w:pPr>
+        <w:pStyle w:val="NovelBody"/>
+        <w:rPr>
+          <w:lang w:val="es-NI"/>
+        </w:rPr>
+      </w:pPr>
+      <w:r>
+        <w:rPr>
+          <w:lang w:val="es-NI"/>
+        </w:rPr>
+        <w:t>—A veces siento una dirección relacionada con él.</w:t>
       </w:r>
     </w:p>
     <w:p>
@@ -17947,7 +17778,7 @@
         <w:rPr>
           <w:lang w:val="es-NI"/>
         </w:rPr>
-        <w:t>—No lo sé completo.</w:t>
+        <w:t>—No lo sé completo. Ni siquiera sé si lo que siento alcanza a Clancy de la misma forma.</w:t>
       </w:r>
     </w:p>
     <w:p>
@@ -17975,7 +17806,7 @@
         <w:rPr>
           <w:lang w:val="es-NI"/>
         </w:rPr>
-        <w:t>—Es la única que tengo.</w:t>
+        <w:t>—Es la única que puedo sostener sin inventar.</w:t>
       </w:r>
     </w:p>
     <w:p>
@@ -18000,7 +17831,7 @@
         </w:rPr>
       </w:pPr>
       <w:r>
-        <w:t>Torchbearer explicó que, desde la primera fuga, había sentido momentos en los que Clancy se alejaba de una ruta física y necesitaba una referencia. No era una voz transmitida por radio ni un sueño que pudiera provocar a voluntad. A veces solo conseguía sostener una intención —arriba, este, respira, no te detengas— y después ignoraba qué parte había alcanzado a Clancy.</w:t>
+        <w:t>El Portador explicó que, desde la primera fuga, había sentido momentos en los que la orientación de Clancy parecía desviarse de una ruta física. No era una voz transmitida por radio ni un sueño que pudiera provocar a voluntad. A veces solo percibía una intención —arriba, este, respira, no te detengas— y después ignoraba si aquella intención había salido de él, llegado a Clancy o coincidido con algo que ambos recordaban.</w:t>
       </w:r>
     </w:p>
     <w:p>
@@ -18025,21 +17856,49 @@
         </w:rPr>
       </w:pPr>
       <w:r>
-        <w:t>—A veces percibo un lugar como un recuerdo que no es mío. Otras veces solo sé que está decidiendo. No puedo elegir cuándo ocurre ni demostrar de dónde viene.</w:t>
-      </w:r>
-    </w:p>
-    <w:p>
-      <w:pPr>
-        <w:pStyle w:val="NovelBody"/>
-        <w:rPr>
-          <w:lang w:val="es-NI"/>
-        </w:rPr>
-      </w:pPr>
-      <w:r>
-        <w:rPr>
-          <w:lang w:val="es-NI"/>
-        </w:rPr>
-        <w:t>—¿Puedes mover cosas?</w:t>
+        <w:t>—No como veo esta habitación. A veces recibo un lugar parecido a un recuerdo ajeno. Otras veces solo noto que una decisión está ocurriendo. No puedo elegir cuándo ni demostrar su origen.</w:t>
+      </w:r>
+    </w:p>
+    <w:p>
+      <w:pPr>
+        <w:pStyle w:val="NovelBody"/>
+        <w:rPr>
+          <w:lang w:val="es-NI"/>
+        </w:rPr>
+      </w:pPr>
+      <w:r>
+        <w:rPr>
+          <w:lang w:val="es-NI"/>
+        </w:rPr>
+        <w:t>—¿Puedes mover cosas mediante esa sensación?</w:t>
+      </w:r>
+    </w:p>
+    <w:p>
+      <w:pPr>
+        <w:pStyle w:val="NovelBody"/>
+        <w:rPr>
+          <w:lang w:val="es-NI"/>
+        </w:rPr>
+      </w:pPr>
+      <w:r>
+        <w:rPr>
+          <w:lang w:val="es-NI"/>
+        </w:rPr>
+        <w:t>—Nunca lo he conseguido.</w:t>
+      </w:r>
+    </w:p>
+    <w:p>
+      <w:pPr>
+        <w:pStyle w:val="NovelBody"/>
+        <w:rPr>
+          <w:lang w:val="es-NI"/>
+        </w:rPr>
+      </w:pPr>
+      <w:r>
+        <w:rPr>
+          <w:lang w:val="es-NI"/>
+        </w:rPr>
+        <w:t>—¿Abrir puertas?</w:t>
       </w:r>
     </w:p>
     <w:p>
@@ -18067,7 +17926,293 @@
         <w:rPr>
           <w:lang w:val="es-NI"/>
         </w:rPr>
-        <w:t>—¿Abrir puertas?</w:t>
+        <w:t>—¿Escuchar lo que dice?</w:t>
+      </w:r>
+    </w:p>
+    <w:p>
+      <w:pPr>
+        <w:pStyle w:val="NovelBody"/>
+        <w:rPr>
+          <w:lang w:val="es-NI"/>
+        </w:rPr>
+      </w:pPr>
+      <w:r>
+        <w:rPr>
+          <w:lang w:val="es-NI"/>
+        </w:rPr>
+        <w:t>—Fragmentos, o algo que se parece a ellos.</w:t>
+      </w:r>
+    </w:p>
+    <w:p>
+      <w:pPr>
+        <w:pStyle w:val="NovelBody"/>
+        <w:rPr>
+          <w:lang w:val="es-NI"/>
+        </w:rPr>
+      </w:pPr>
+      <w:r>
+        <w:rPr>
+          <w:lang w:val="es-NI"/>
+        </w:rPr>
+        <w:t>Mara pensó en Clancy dentro del agua, respondiendo hacia un lugar donde el pasajero no había visto un segundo cuerpo. Pensó en los diálogos completos descritos en la cinta. Nada demostraba que ambas experiencias fueran el mismo fenómeno.</w:t>
+      </w:r>
+    </w:p>
+    <w:p>
+      <w:pPr>
+        <w:pStyle w:val="NovelBody"/>
+        <w:rPr>
+          <w:lang w:val="es-NI"/>
+        </w:rPr>
+      </w:pPr>
+      <w:r>
+        <w:rPr>
+          <w:lang w:val="es-NI"/>
+        </w:rPr>
+        <w:t>—Clancy escuchó más que fragmentos.</w:t>
+      </w:r>
+    </w:p>
+    <w:p>
+      <w:pPr>
+        <w:pStyle w:val="NovelBody"/>
+        <w:rPr>
+          <w:lang w:val="es-NI"/>
+        </w:rPr>
+      </w:pPr>
+      <w:r>
+        <w:rPr>
+          <w:lang w:val="es-NI"/>
+        </w:rPr>
+        <w:t>—Entonces quizá completó lo que faltaba.</w:t>
+      </w:r>
+    </w:p>
+    <w:p>
+      <w:pPr>
+        <w:pStyle w:val="NovelBody"/>
+        <w:rPr>
+          <w:lang w:val="es-NI"/>
+        </w:rPr>
+      </w:pPr>
+      <w:r>
+        <w:rPr>
+          <w:lang w:val="es-NI"/>
+        </w:rPr>
+        <w:t>—¿Con recuerdos tuyos?</w:t>
+      </w:r>
+    </w:p>
+    <w:p>
+      <w:pPr>
+        <w:pStyle w:val="NovelBody"/>
+        <w:rPr>
+          <w:lang w:val="es-NI"/>
+        </w:rPr>
+      </w:pPr>
+      <w:r>
+        <w:rPr>
+          <w:lang w:val="es-NI"/>
+        </w:rPr>
+        <w:t>—Quizá.</w:t>
+      </w:r>
+    </w:p>
+    <w:p>
+      <w:pPr>
+        <w:pStyle w:val="NovelBody"/>
+        <w:rPr>
+          <w:lang w:val="es-NI"/>
+        </w:rPr>
+      </w:pPr>
+      <w:r>
+        <w:rPr>
+          <w:lang w:val="es-NI"/>
+        </w:rPr>
+        <w:t>—¿Con lo que necesitaba que dijeras?</w:t>
+      </w:r>
+    </w:p>
+    <w:p>
+      <w:pPr>
+        <w:pStyle w:val="NovelBody"/>
+        <w:rPr>
+          <w:lang w:val="es-NI"/>
+        </w:rPr>
+      </w:pPr>
+      <w:proofErr w:type="spellStart"/>
+      <w:proofErr w:type="spellEnd"/>
+      <w:r>
+        <w:rPr>
+          <w:lang w:val="es-NI"/>
+        </w:rPr>
+        <w:t>El Portador no apartó la mirada.</w:t>
+      </w:r>
+    </w:p>
+    <w:p>
+      <w:pPr>
+        <w:pStyle w:val="NovelBody"/>
+        <w:rPr>
+          <w:lang w:val="es-NI"/>
+        </w:rPr>
+      </w:pPr>
+      <w:r>
+        <w:rPr>
+          <w:lang w:val="es-NI"/>
+        </w:rPr>
+        <w:t>—También es posible.</w:t>
+      </w:r>
+    </w:p>
+    <w:p>
+      <w:pPr>
+        <w:pStyle w:val="NovelBody"/>
+        <w:rPr>
+          <w:lang w:val="es-NI"/>
+        </w:rPr>
+      </w:pPr>
+      <w:r>
+        <w:rPr>
+          <w:lang w:val="es-NI"/>
+        </w:rPr>
+        <w:t>La respuesta resultaba más inquietante que una mentira.</w:t>
+      </w:r>
+    </w:p>
+    <w:p>
+      <w:pPr>
+        <w:pStyle w:val="NovelBody"/>
+        <w:rPr>
+          <w:lang w:val="es-NI"/>
+        </w:rPr>
+      </w:pPr>
+      <w:proofErr w:type="spellStart"/>
+      <w:proofErr w:type="spellEnd"/>
+      <w:r>
+        <w:rPr>
+          <w:lang w:val="es-NI"/>
+        </w:rPr>
+        <w:t>Mara formuló una hipótesis que todavía no podía probar: quizá Clancy había recibido una dirección real y construido alrededor una presencia capaz de sostenerlo. También podía haber unido trauma, recuerdos y la silueta de un técnico. Ninguna versión explicaba todavía todas las manos, puertas y voces.</w:t>
+      </w:r>
+    </w:p>
+    <w:p>
+      <w:pPr>
+        <w:pStyle w:val="NovelBody"/>
+        <w:rPr>
+          <w:lang w:val="es-NI"/>
+        </w:rPr>
+      </w:pPr>
+      <w:r>
+        <w:rPr>
+          <w:lang w:val="es-NI"/>
+        </w:rPr>
+        <w:t>Mara pensó en todas las acciones de Saturday.</w:t>
+      </w:r>
+    </w:p>
+    <w:p>
+      <w:pPr>
+        <w:pStyle w:val="NovelBody"/>
+        <w:rPr>
+          <w:lang w:val="es-NI"/>
+        </w:rPr>
+      </w:pPr>
+      <w:r>
+        <w:rPr>
+          <w:lang w:val="es-NI"/>
+        </w:rPr>
+        <w:t>Las palancas.</w:t>
+      </w:r>
+    </w:p>
+    <w:p>
+      <w:pPr>
+        <w:pStyle w:val="NovelBody"/>
+        <w:rPr>
+          <w:lang w:val="es-NI"/>
+        </w:rPr>
+      </w:pPr>
+      <w:r>
+        <w:rPr>
+          <w:lang w:val="es-NI"/>
+        </w:rPr>
+        <w:t>El panel.</w:t>
+      </w:r>
+    </w:p>
+    <w:p>
+      <w:pPr>
+        <w:pStyle w:val="NovelBody"/>
+        <w:rPr>
+          <w:lang w:val="es-NI"/>
+        </w:rPr>
+      </w:pPr>
+      <w:r>
+        <w:rPr>
+          <w:lang w:val="es-NI"/>
+        </w:rPr>
+        <w:t>El pasajero.</w:t>
+      </w:r>
+    </w:p>
+    <w:p>
+      <w:pPr>
+        <w:pStyle w:val="NovelBody"/>
+        <w:rPr>
+          <w:lang w:val="es-NI"/>
+        </w:rPr>
+      </w:pPr>
+      <w:r>
+        <w:rPr>
+          <w:lang w:val="es-NI"/>
+        </w:rPr>
+        <w:t>La corriente.</w:t>
+      </w:r>
+    </w:p>
+    <w:p>
+      <w:pPr>
+        <w:pStyle w:val="NovelBody"/>
+        <w:rPr>
+          <w:lang w:val="es-NI"/>
+        </w:rPr>
+      </w:pPr>
+      <w:r>
+        <w:rPr>
+          <w:lang w:val="es-NI"/>
+        </w:rPr>
+        <w:t>—Entonces creyó estar acompañado —dijo.</w:t>
+      </w:r>
+    </w:p>
+    <w:p>
+      <w:pPr>
+        <w:pStyle w:val="NovelBody"/>
+        <w:rPr>
+          <w:lang w:val="es-NI"/>
+        </w:rPr>
+      </w:pPr>
+      <w:proofErr w:type="spellStart"/>
+      <w:proofErr w:type="spellEnd"/>
+      <w:r>
+        <w:rPr>
+          <w:lang w:val="es-NI"/>
+        </w:rPr>
+        <w:t>El Portador negó lentamente.</w:t>
+      </w:r>
+    </w:p>
+    <w:p>
+      <w:pPr>
+        <w:pStyle w:val="NovelBody"/>
+        <w:rPr>
+          <w:lang w:val="es-NI"/>
+        </w:rPr>
+      </w:pPr>
+      <w:r>
+        <w:rPr>
+          <w:lang w:val="es-NI"/>
+        </w:rPr>
+        <w:t>—No puedo afirmar qué forma tuvo esa compañía.</w:t>
+      </w:r>
+    </w:p>
+    <w:p>
+      <w:pPr>
+        <w:pStyle w:val="NovelBody"/>
+        <w:rPr>
+          <w:lang w:val="es-NI"/>
+        </w:rPr>
+      </w:pPr>
+      <w:r>
+        <w:rPr>
+          <w:lang w:val="es-NI"/>
+        </w:rPr>
+        <w:t>—No recuerdas cargar a nadie.</w:t>
       </w:r>
     </w:p>
     <w:p>
@@ -18095,105 +18240,211 @@
         <w:rPr>
           <w:lang w:val="es-NI"/>
         </w:rPr>
-        <w:t>—¿Escuchar lo que dice?</w:t>
-      </w:r>
-    </w:p>
-    <w:p>
-      <w:pPr>
-        <w:pStyle w:val="NovelBody"/>
-        <w:rPr>
-          <w:lang w:val="es-NI"/>
-        </w:rPr>
-      </w:pPr>
-      <w:r>
-        <w:rPr>
-          <w:lang w:val="es-NI"/>
-        </w:rPr>
-        <w:t>—Fragmentos.</w:t>
-      </w:r>
-    </w:p>
-    <w:p>
-      <w:pPr>
-        <w:pStyle w:val="NovelBody"/>
-        <w:rPr>
-          <w:lang w:val="es-NI"/>
-        </w:rPr>
-      </w:pPr>
-      <w:r>
-        <w:rPr>
-          <w:lang w:val="es-NI"/>
-        </w:rPr>
-        <w:t>Mara pensó en Clancy dentro del agua, respondiendo a una figura que no dejaba huellas. Pensó en los diálogos completos que el pasajero había descrito.</w:t>
-      </w:r>
-    </w:p>
-    <w:p>
-      <w:pPr>
-        <w:pStyle w:val="NovelBody"/>
-        <w:rPr>
-          <w:lang w:val="es-NI"/>
-        </w:rPr>
-      </w:pPr>
-      <w:r>
-        <w:rPr>
-          <w:lang w:val="es-NI"/>
-        </w:rPr>
-        <w:t>—Clancy escuchó más que fragmentos.</w:t>
-      </w:r>
-    </w:p>
-    <w:p>
-      <w:pPr>
-        <w:pStyle w:val="NovelBody"/>
-        <w:rPr>
-          <w:lang w:val="es-NI"/>
-        </w:rPr>
-      </w:pPr>
-      <w:r>
-        <w:rPr>
-          <w:lang w:val="es-NI"/>
-        </w:rPr>
-        <w:t>—Entonces completó lo que faltaba.</w:t>
-      </w:r>
-    </w:p>
-    <w:p>
-      <w:pPr>
-        <w:pStyle w:val="NovelBody"/>
-        <w:rPr>
-          <w:lang w:val="es-NI"/>
-        </w:rPr>
-      </w:pPr>
-      <w:r>
-        <w:rPr>
-          <w:lang w:val="es-NI"/>
-        </w:rPr>
-        <w:t>—¿Con recuerdos tuyos?</w:t>
-      </w:r>
-    </w:p>
-    <w:p>
-      <w:pPr>
-        <w:pStyle w:val="NovelBody"/>
-        <w:rPr>
-          <w:lang w:val="es-NI"/>
-        </w:rPr>
-      </w:pPr>
-      <w:r>
-        <w:rPr>
-          <w:lang w:val="es-NI"/>
-        </w:rPr>
-        <w:t>—Quizá.</w:t>
-      </w:r>
-    </w:p>
-    <w:p>
-      <w:pPr>
-        <w:pStyle w:val="NovelBody"/>
-        <w:rPr>
-          <w:lang w:val="es-NI"/>
-        </w:rPr>
-      </w:pPr>
-      <w:r>
-        <w:rPr>
-          <w:lang w:val="es-NI"/>
-        </w:rPr>
-        <w:t>—¿Con lo que necesitaba que dijeras?</w:t>
+        <w:t>—No recuerdas abrir la escotilla.</w:t>
+      </w:r>
+    </w:p>
+    <w:p>
+      <w:pPr>
+        <w:pStyle w:val="NovelBody"/>
+        <w:rPr>
+          <w:lang w:val="es-NI"/>
+        </w:rPr>
+      </w:pPr>
+      <w:r>
+        <w:rPr>
+          <w:lang w:val="es-NI"/>
+        </w:rPr>
+        <w:t>—No.</w:t>
+      </w:r>
+    </w:p>
+    <w:p>
+      <w:pPr>
+        <w:pStyle w:val="NovelBody"/>
+        <w:rPr>
+          <w:lang w:val="es-NI"/>
+        </w:rPr>
+      </w:pPr>
+      <w:r>
+        <w:rPr>
+          <w:lang w:val="es-NI"/>
+        </w:rPr>
+        <w:t>—No recuerdas sacar al pasajero del agua.</w:t>
+      </w:r>
+    </w:p>
+    <w:p>
+      <w:pPr>
+        <w:pStyle w:val="NovelBody"/>
+        <w:rPr>
+          <w:lang w:val="es-NI"/>
+        </w:rPr>
+      </w:pPr>
+      <w:r>
+        <w:rPr>
+          <w:lang w:val="es-NI"/>
+        </w:rPr>
+        <w:t>—No.</w:t>
+      </w:r>
+    </w:p>
+    <w:p>
+      <w:pPr>
+        <w:pStyle w:val="NovelBody"/>
+        <w:rPr>
+          <w:lang w:val="es-NI"/>
+        </w:rPr>
+      </w:pPr>
+      <w:r>
+        <w:t>—Entonces las acciones que el testigo atribuye a Clancy siguen perteneciendo a Clancy.</w:t>
+      </w:r>
+    </w:p>
+    <w:p>
+      <w:pPr>
+        <w:pStyle w:val="NovelBody"/>
+        <w:rPr>
+          <w:lang w:val="es-NI"/>
+        </w:rPr>
+      </w:pPr>
+      <w:r>
+        <w:rPr>
+          <w:lang w:val="es-NI"/>
+        </w:rPr>
+        <w:t>—Eso es lo que sostiene la evidencia que tienen.</w:t>
+      </w:r>
+    </w:p>
+    <w:p>
+      <w:pPr>
+        <w:pStyle w:val="NovelBody"/>
+        <w:rPr>
+          <w:lang w:val="es-NI"/>
+        </w:rPr>
+      </w:pPr>
+      <w:r>
+        <w:t>La respuesta no borraba al técnico. Alguien físico había utilizado la credencial, llevado el mango de la antorcha y dejado señales junto a la batería. Después, el testimonio situaba a Clancy sosteniendo al pasajero, alcanzando la costa y preparando la baliza. La presencia que el pasajero no podía ver podía haber orientado, acompañado o surgido de la necesidad; todavía no podían convertir ninguna posibilidad en mecanismo.</w:t>
+      </w:r>
+    </w:p>
+    <w:p>
+      <w:pPr>
+        <w:pStyle w:val="NovelBody"/>
+        <w:rPr>
+          <w:lang w:val="es-NI"/>
+        </w:rPr>
+      </w:pPr>
+      <w:r>
+        <w:rPr>
+          <w:lang w:val="es-NI"/>
+        </w:rPr>
+        <w:t>—Él no sabe que estamos separando las acciones de esa manera —dijo Mara.</w:t>
+      </w:r>
+    </w:p>
+    <w:p>
+      <w:pPr>
+        <w:pStyle w:val="NovelBody"/>
+        <w:rPr>
+          <w:lang w:val="es-NI"/>
+        </w:rPr>
+      </w:pPr>
+      <w:r>
+        <w:rPr>
+          <w:lang w:val="es-NI"/>
+        </w:rPr>
+        <w:t>—No todavía.</w:t>
+      </w:r>
+    </w:p>
+    <w:p>
+      <w:pPr>
+        <w:pStyle w:val="NovelBody"/>
+        <w:rPr>
+          <w:lang w:val="es-NI"/>
+        </w:rPr>
+      </w:pPr>
+      <w:r>
+        <w:rPr>
+          <w:lang w:val="es-NI"/>
+        </w:rPr>
+        <w:t>—¿Por qué no se lo dijiste?</w:t>
+      </w:r>
+    </w:p>
+    <w:p>
+      <w:pPr>
+        <w:pStyle w:val="NovelBody"/>
+        <w:rPr>
+          <w:lang w:val="es-NI"/>
+        </w:rPr>
+      </w:pPr>
+      <w:r>
+        <w:rPr>
+          <w:lang w:val="es-NI"/>
+        </w:rPr>
+        <w:t>—Porque no sabía qué estaba viendo él ni qué estaba sintiendo yo.</w:t>
+      </w:r>
+    </w:p>
+    <w:p>
+      <w:pPr>
+        <w:pStyle w:val="NovelBody"/>
+        <w:rPr>
+          <w:lang w:val="es-NI"/>
+        </w:rPr>
+      </w:pPr>
+      <w:r>
+        <w:rPr>
+          <w:lang w:val="es-NI"/>
+        </w:rPr>
+        <w:t>—Ahora sabes algo más.</w:t>
+      </w:r>
+    </w:p>
+    <w:p>
+      <w:pPr>
+        <w:pStyle w:val="NovelBody"/>
+        <w:rPr>
+          <w:lang w:val="es-NI"/>
+        </w:rPr>
+      </w:pPr>
+      <w:r>
+        <w:rPr>
+          <w:lang w:val="es-NI"/>
+        </w:rPr>
+        <w:t>—Ahora sé que su relato coloca mi rostro en un lugar donde no puedo verificar mi cuerpo.</w:t>
+      </w:r>
+    </w:p>
+    <w:p>
+      <w:pPr>
+        <w:pStyle w:val="NovelBody"/>
+        <w:rPr>
+          <w:lang w:val="es-NI"/>
+        </w:rPr>
+      </w:pPr>
+      <w:r>
+        <w:rPr>
+          <w:lang w:val="es-NI"/>
+        </w:rPr>
+        <w:t>James miró el receptor.</w:t>
+      </w:r>
+    </w:p>
+    <w:p>
+      <w:pPr>
+        <w:pStyle w:val="NovelBody"/>
+        <w:rPr>
+          <w:lang w:val="es-NI"/>
+        </w:rPr>
+      </w:pPr>
+      <w:r>
+        <w:rPr>
+          <w:lang w:val="es-NI"/>
+        </w:rPr>
+        <w:t>—Cinco minutos.</w:t>
+      </w:r>
+    </w:p>
+    <w:p>
+      <w:pPr>
+        <w:pStyle w:val="SceneDivider"/>
+        <w:rPr>
+          <w:lang w:val="es-NI"/>
+        </w:rPr>
+      </w:pPr>
+      <w:r>
+        <w:rPr>
+          <w:lang w:val="es-NI"/>
+        </w:rPr>
+        <w:t>• • •</w:t>
       </w:r>
     </w:p>
     <w:p>
@@ -18204,448 +18455,152 @@
         </w:rPr>
       </w:pPr>
       <w:proofErr w:type="spellStart"/>
-      <w:r>
-        <w:rPr>
-          <w:lang w:val="es-NI"/>
-        </w:rPr>
-        <w:t>Torchbearer</w:t>
-      </w:r>
       <w:proofErr w:type="spellEnd"/>
       <w:r>
         <w:rPr>
           <w:lang w:val="es-NI"/>
         </w:rPr>
-        <w:t xml:space="preserve"> no apartó la mirada.</w:t>
-      </w:r>
-    </w:p>
-    <w:p>
-      <w:pPr>
-        <w:pStyle w:val="NovelBody"/>
-        <w:rPr>
-          <w:lang w:val="es-NI"/>
-        </w:rPr>
-      </w:pPr>
-      <w:r>
-        <w:rPr>
-          <w:lang w:val="es-NI"/>
-        </w:rPr>
-        <w:t>—También.</w:t>
-      </w:r>
-    </w:p>
-    <w:p>
-      <w:pPr>
-        <w:pStyle w:val="NovelBody"/>
-        <w:rPr>
-          <w:lang w:val="es-NI"/>
-        </w:rPr>
-      </w:pPr>
-      <w:r>
-        <w:rPr>
-          <w:lang w:val="es-NI"/>
-        </w:rPr>
-        <w:t>La respuesta resultaba más inquietante que una mentira.</w:t>
-      </w:r>
-    </w:p>
-    <w:p>
-      <w:pPr>
-        <w:pStyle w:val="NovelBody"/>
-        <w:rPr>
-          <w:lang w:val="es-NI"/>
-        </w:rPr>
-      </w:pPr>
-      <w:r>
-        <w:rPr>
-          <w:lang w:val="es-NI"/>
-        </w:rPr>
-        <w:t xml:space="preserve">Clancy no había inventado necesariamente al </w:t>
+        <w:t>El Portador abrió la mochila.</w:t>
+      </w:r>
+    </w:p>
+    <w:p>
+      <w:pPr>
+        <w:pStyle w:val="NovelBody"/>
+        <w:rPr>
+          <w:lang w:val="es-NI"/>
+        </w:rPr>
+      </w:pPr>
+      <w:r>
+        <w:rPr>
+          <w:lang w:val="es-NI"/>
+        </w:rPr>
+        <w:t>Dentro había mapas costeros, una lista de rutas Bandito y una pieza de tela con el símbolo de Bram. No entregó los mapas completos. Mara no le pidió hacerlo.</w:t>
+      </w:r>
+    </w:p>
+    <w:p>
+      <w:pPr>
+        <w:pStyle w:val="NovelBody"/>
+        <w:rPr>
+          <w:lang w:val="es-NI"/>
+        </w:rPr>
+      </w:pPr>
+      <w:r>
+        <w:rPr>
+          <w:lang w:val="es-NI"/>
+        </w:rPr>
+        <w:t>—La señal de 9-E llegó hasta nosotros —dijo—. No las palabras. La frecuencia. Después vimos las luces de los distritos.</w:t>
+      </w:r>
+    </w:p>
+    <w:p>
+      <w:pPr>
+        <w:pStyle w:val="NovelBody"/>
+        <w:rPr>
+          <w:lang w:val="es-NI"/>
+        </w:rPr>
+      </w:pPr>
+      <w:r>
+        <w:rPr>
+          <w:lang w:val="es-NI"/>
+        </w:rPr>
+        <w:t xml:space="preserve">—¿Clancy está en </w:t>
       </w:r>
       <w:proofErr w:type="spellStart"/>
       <w:r>
         <w:rPr>
           <w:lang w:val="es-NI"/>
         </w:rPr>
-        <w:t>Torchbearer</w:t>
+        <w:t>Voldsøy</w:t>
       </w:r>
       <w:proofErr w:type="spellEnd"/>
       <w:r>
         <w:rPr>
           <w:lang w:val="es-NI"/>
         </w:rPr>
-        <w:t xml:space="preserve">. Había recibido una dirección real y construido alrededor una presencia capaz de sostenerlo. El guía había estado allí de una </w:t>
-      </w:r>
-      <w:r>
-        <w:rPr>
-          <w:lang w:val="es-NI"/>
-        </w:rPr>
-        <w:lastRenderedPageBreak/>
-        <w:t>forma que no podía abrir una puerta. Las manos habían sido de Clancy.</w:t>
-      </w:r>
-    </w:p>
-    <w:p>
-      <w:pPr>
-        <w:pStyle w:val="NovelBody"/>
-        <w:rPr>
-          <w:lang w:val="es-NI"/>
-        </w:rPr>
-      </w:pPr>
-      <w:r>
-        <w:rPr>
-          <w:lang w:val="es-NI"/>
-        </w:rPr>
-        <w:t>Mara pensó en todas las acciones de Saturday.</w:t>
-      </w:r>
-    </w:p>
-    <w:p>
-      <w:pPr>
-        <w:pStyle w:val="NovelBody"/>
-        <w:rPr>
-          <w:lang w:val="es-NI"/>
-        </w:rPr>
-      </w:pPr>
-      <w:r>
-        <w:rPr>
-          <w:lang w:val="es-NI"/>
-        </w:rPr>
-        <w:t>Las palancas.</w:t>
-      </w:r>
-    </w:p>
-    <w:p>
-      <w:pPr>
-        <w:pStyle w:val="NovelBody"/>
-        <w:rPr>
-          <w:lang w:val="es-NI"/>
-        </w:rPr>
-      </w:pPr>
-      <w:r>
-        <w:rPr>
-          <w:lang w:val="es-NI"/>
-        </w:rPr>
-        <w:t>El panel.</w:t>
-      </w:r>
-    </w:p>
-    <w:p>
-      <w:pPr>
-        <w:pStyle w:val="NovelBody"/>
-        <w:rPr>
-          <w:lang w:val="es-NI"/>
-        </w:rPr>
-      </w:pPr>
-      <w:r>
-        <w:rPr>
-          <w:lang w:val="es-NI"/>
-        </w:rPr>
-        <w:t>El pasajero.</w:t>
-      </w:r>
-    </w:p>
-    <w:p>
-      <w:pPr>
-        <w:pStyle w:val="NovelBody"/>
-        <w:rPr>
-          <w:lang w:val="es-NI"/>
-        </w:rPr>
-      </w:pPr>
-      <w:r>
-        <w:rPr>
-          <w:lang w:val="es-NI"/>
-        </w:rPr>
-        <w:t>La corriente.</w:t>
-      </w:r>
-    </w:p>
-    <w:p>
-      <w:pPr>
-        <w:pStyle w:val="NovelBody"/>
-        <w:rPr>
-          <w:lang w:val="es-NI"/>
-        </w:rPr>
-      </w:pPr>
-      <w:r>
-        <w:rPr>
-          <w:lang w:val="es-NI"/>
-        </w:rPr>
-        <w:t>—Entonces estuvo solo —dijo.</w:t>
-      </w:r>
-    </w:p>
-    <w:p>
-      <w:pPr>
-        <w:pStyle w:val="NovelBody"/>
-        <w:rPr>
-          <w:lang w:val="es-NI"/>
-        </w:rPr>
-      </w:pPr>
+        <w:t>? —preguntó Mara.</w:t>
+      </w:r>
+    </w:p>
+    <w:p>
+      <w:pPr>
+        <w:pStyle w:val="NovelBody"/>
+        <w:rPr>
+          <w:lang w:val="es-NI"/>
+        </w:rPr>
+      </w:pPr>
+      <w:r>
+        <w:rPr>
+          <w:lang w:val="es-NI"/>
+        </w:rPr>
+        <w:t xml:space="preserve">—No conozco el nombre del lugar con certeza. Sabemos que existe una isla al este y que algo desde allí alcanzó el cuerpo de </w:t>
+      </w:r>
       <w:proofErr w:type="spellStart"/>
       <w:r>
         <w:rPr>
           <w:lang w:val="es-NI"/>
         </w:rPr>
-        <w:t>Torchbearer</w:t>
+        <w:t>Keons</w:t>
       </w:r>
       <w:proofErr w:type="spellEnd"/>
       <w:r>
         <w:rPr>
           <w:lang w:val="es-NI"/>
         </w:rPr>
-        <w:t xml:space="preserve"> negó lentamente.</w:t>
-      </w:r>
-    </w:p>
-    <w:p>
-      <w:pPr>
-        <w:pStyle w:val="NovelBody"/>
-        <w:rPr>
-          <w:lang w:val="es-NI"/>
-        </w:rPr>
-      </w:pPr>
-      <w:r>
-        <w:rPr>
-          <w:lang w:val="es-NI"/>
-        </w:rPr>
-        <w:t>—No de la manera que importa.</w:t>
-      </w:r>
-    </w:p>
-    <w:p>
-      <w:pPr>
-        <w:pStyle w:val="NovelBody"/>
-        <w:rPr>
-          <w:lang w:val="es-NI"/>
-        </w:rPr>
-      </w:pPr>
-      <w:r>
-        <w:rPr>
-          <w:lang w:val="es-NI"/>
-        </w:rPr>
-        <w:t>—No cargaste a nadie.</w:t>
-      </w:r>
-    </w:p>
-    <w:p>
-      <w:pPr>
-        <w:pStyle w:val="NovelBody"/>
-        <w:rPr>
-          <w:lang w:val="es-NI"/>
-        </w:rPr>
-      </w:pPr>
-      <w:r>
-        <w:rPr>
-          <w:lang w:val="es-NI"/>
-        </w:rPr>
-        <w:t>—No.</w:t>
-      </w:r>
-    </w:p>
-    <w:p>
-      <w:pPr>
-        <w:pStyle w:val="NovelBody"/>
-        <w:rPr>
-          <w:lang w:val="es-NI"/>
-        </w:rPr>
-      </w:pPr>
-      <w:r>
-        <w:rPr>
-          <w:lang w:val="es-NI"/>
-        </w:rPr>
-        <w:t>—No abriste la escotilla.</w:t>
-      </w:r>
-    </w:p>
-    <w:p>
-      <w:pPr>
-        <w:pStyle w:val="NovelBody"/>
-        <w:rPr>
-          <w:lang w:val="es-NI"/>
-        </w:rPr>
-      </w:pPr>
-      <w:r>
-        <w:rPr>
-          <w:lang w:val="es-NI"/>
-        </w:rPr>
-        <w:t>—No.</w:t>
-      </w:r>
-    </w:p>
-    <w:p>
-      <w:pPr>
-        <w:pStyle w:val="NovelBody"/>
-        <w:rPr>
-          <w:lang w:val="es-NI"/>
-        </w:rPr>
-      </w:pPr>
-      <w:r>
-        <w:rPr>
-          <w:lang w:val="es-NI"/>
-        </w:rPr>
-        <w:t>—No lo sacaste del agua.</w:t>
-      </w:r>
-    </w:p>
-    <w:p>
-      <w:pPr>
-        <w:pStyle w:val="NovelBody"/>
-        <w:rPr>
-          <w:lang w:val="es-NI"/>
-        </w:rPr>
-      </w:pPr>
-      <w:r>
-        <w:rPr>
-          <w:lang w:val="es-NI"/>
-        </w:rPr>
-        <w:t>—No.</w:t>
-      </w:r>
-    </w:p>
-    <w:p>
-      <w:pPr>
-        <w:pStyle w:val="NovelBody"/>
-        <w:rPr>
-          <w:lang w:val="es-NI"/>
-        </w:rPr>
-      </w:pPr>
-      <w:r>
-        <w:t>—Entonces esas acciones las hizo él.</w:t>
-      </w:r>
-    </w:p>
-    <w:p>
-      <w:pPr>
-        <w:pStyle w:val="NovelBody"/>
-        <w:rPr>
-          <w:lang w:val="es-NI"/>
-        </w:rPr>
-      </w:pPr>
-      <w:r>
-        <w:rPr>
-          <w:lang w:val="es-NI"/>
-        </w:rPr>
-        <w:t>—Sí.</w:t>
-      </w:r>
-    </w:p>
-    <w:p>
-      <w:pPr>
-        <w:pStyle w:val="NovelBody"/>
-        <w:rPr>
-          <w:lang w:val="es-NI"/>
-        </w:rPr>
-      </w:pPr>
-      <w:r>
-        <w:t>La respuesta no borraba al técnico. Alguien físico había recogido la credencial, llevado el mango de la antorcha, dejado señales junto a la batería y abierto una posibilidad antes de separarse de Clancy. Pero las palancas de la sala de control, la escotilla, el ascenso y el rescate del pasajero ocurrieron después. Esas acciones sí habían sido de Clancy. Mara sintió orgullo y dolor al mismo tiempo: necesitó una dirección, pero ninguna presencia sin cuerpo pudo realizar por él el esfuerzo material.</w:t>
-      </w:r>
-    </w:p>
-    <w:p>
-      <w:pPr>
-        <w:pStyle w:val="NovelBody"/>
-        <w:rPr>
-          <w:lang w:val="es-NI"/>
-        </w:rPr>
-      </w:pPr>
-      <w:r>
-        <w:rPr>
-          <w:lang w:val="es-NI"/>
-        </w:rPr>
-        <w:t>—Él no lo sabe —dijo.</w:t>
-      </w:r>
-    </w:p>
-    <w:p>
-      <w:pPr>
-        <w:pStyle w:val="NovelBody"/>
-        <w:rPr>
-          <w:lang w:val="es-NI"/>
-        </w:rPr>
-      </w:pPr>
-      <w:r>
-        <w:rPr>
-          <w:lang w:val="es-NI"/>
-        </w:rPr>
-        <w:t>—No todavía.</w:t>
-      </w:r>
-    </w:p>
-    <w:p>
-      <w:pPr>
-        <w:pStyle w:val="NovelBody"/>
-        <w:rPr>
-          <w:lang w:val="es-NI"/>
-        </w:rPr>
-      </w:pPr>
-      <w:r>
-        <w:rPr>
-          <w:lang w:val="es-NI"/>
-        </w:rPr>
-        <w:t>—¿Por qué no se lo dijiste?</w:t>
-      </w:r>
-    </w:p>
-    <w:p>
-      <w:pPr>
-        <w:pStyle w:val="NovelBody"/>
-        <w:rPr>
-          <w:lang w:val="es-NI"/>
-        </w:rPr>
-      </w:pPr>
-      <w:r>
-        <w:rPr>
-          <w:lang w:val="es-NI"/>
-        </w:rPr>
-        <w:lastRenderedPageBreak/>
-        <w:t>—Porque no sabía cómo me veía.</w:t>
-      </w:r>
-    </w:p>
-    <w:p>
-      <w:pPr>
-        <w:pStyle w:val="NovelBody"/>
-        <w:rPr>
-          <w:lang w:val="es-NI"/>
-        </w:rPr>
-      </w:pPr>
-      <w:r>
-        <w:rPr>
-          <w:lang w:val="es-NI"/>
-        </w:rPr>
-        <w:t>—Ahora lo sabes.</w:t>
-      </w:r>
-    </w:p>
-    <w:p>
-      <w:pPr>
-        <w:pStyle w:val="NovelBody"/>
-        <w:rPr>
-          <w:lang w:val="es-NI"/>
-        </w:rPr>
-      </w:pPr>
-      <w:r>
-        <w:rPr>
-          <w:lang w:val="es-NI"/>
-        </w:rPr>
-        <w:t>—Ahora sé que puede verme donde mi cuerpo no está.</w:t>
-      </w:r>
-    </w:p>
-    <w:p>
-      <w:pPr>
-        <w:pStyle w:val="NovelBody"/>
-        <w:rPr>
-          <w:lang w:val="es-NI"/>
-        </w:rPr>
-      </w:pPr>
-      <w:r>
-        <w:rPr>
-          <w:lang w:val="es-NI"/>
-        </w:rPr>
-        <w:t>James miró el receptor.</w:t>
-      </w:r>
-    </w:p>
-    <w:p>
-      <w:pPr>
-        <w:pStyle w:val="NovelBody"/>
-        <w:rPr>
-          <w:lang w:val="es-NI"/>
-        </w:rPr>
-      </w:pPr>
-      <w:r>
-        <w:rPr>
-          <w:lang w:val="es-NI"/>
-        </w:rPr>
-        <w:t>—Cinco minutos.</w:t>
-      </w:r>
-    </w:p>
-    <w:p>
-      <w:pPr>
-        <w:pStyle w:val="SceneDivider"/>
-        <w:rPr>
-          <w:lang w:val="es-NI"/>
-        </w:rPr>
-      </w:pPr>
-      <w:r>
-        <w:rPr>
-          <w:lang w:val="es-NI"/>
-        </w:rPr>
-        <w:t>• • •</w:t>
+        <w:t>.</w:t>
+      </w:r>
+    </w:p>
+    <w:p>
+      <w:pPr>
+        <w:pStyle w:val="NovelBody"/>
+        <w:rPr>
+          <w:lang w:val="es-NI"/>
+        </w:rPr>
+      </w:pPr>
+      <w:r>
+        <w:rPr>
+          <w:lang w:val="es-NI"/>
+        </w:rPr>
+        <w:t>—¿Algo o Clancy?</w:t>
+      </w:r>
+    </w:p>
+    <w:p>
+      <w:pPr>
+        <w:pStyle w:val="NovelBody"/>
+        <w:rPr>
+          <w:lang w:val="es-NI"/>
+        </w:rPr>
+      </w:pPr>
+      <w:r>
+        <w:rPr>
+          <w:lang w:val="es-NI"/>
+        </w:rPr>
+        <w:t>—La señal lleva su forma.</w:t>
+      </w:r>
+    </w:p>
+    <w:p>
+      <w:pPr>
+        <w:pStyle w:val="NovelBody"/>
+        <w:rPr>
+          <w:lang w:val="es-NI"/>
+        </w:rPr>
+      </w:pPr>
+      <w:r>
+        <w:rPr>
+          <w:lang w:val="es-NI"/>
+        </w:rPr>
+        <w:t>James desplegó un esquema del cadáver.</w:t>
+      </w:r>
+    </w:p>
+    <w:p>
+      <w:pPr>
+        <w:pStyle w:val="NovelBody"/>
+        <w:rPr>
+          <w:lang w:val="es-NI"/>
+        </w:rPr>
+      </w:pPr>
+      <w:r>
+        <w:rPr>
+          <w:lang w:val="es-NI"/>
+        </w:rPr>
+        <w:t>—Los ojos eran amarillos.</w:t>
       </w:r>
     </w:p>
     <w:p>
@@ -18656,258 +18611,84 @@
         </w:rPr>
       </w:pPr>
       <w:proofErr w:type="spellStart"/>
-      <w:r>
-        <w:rPr>
-          <w:lang w:val="es-NI"/>
-        </w:rPr>
-        <w:t>Torchbearer</w:t>
-      </w:r>
       <w:proofErr w:type="spellEnd"/>
       <w:r>
         <w:rPr>
           <w:lang w:val="es-NI"/>
         </w:rPr>
-        <w:t xml:space="preserve"> abrió la mochila.</w:t>
-      </w:r>
-    </w:p>
-    <w:p>
-      <w:pPr>
-        <w:pStyle w:val="NovelBody"/>
-        <w:rPr>
-          <w:lang w:val="es-NI"/>
-        </w:rPr>
-      </w:pPr>
-      <w:r>
-        <w:rPr>
-          <w:lang w:val="es-NI"/>
-        </w:rPr>
-        <w:t>Dentro había mapas costeros, una lista de rutas Bandito y una pieza de tela con el símbolo de Bram. No entregó los mapas completos. Mara no le pidió hacerlo.</w:t>
-      </w:r>
-    </w:p>
-    <w:p>
-      <w:pPr>
-        <w:pStyle w:val="NovelBody"/>
-        <w:rPr>
-          <w:lang w:val="es-NI"/>
-        </w:rPr>
-      </w:pPr>
-      <w:r>
-        <w:rPr>
-          <w:lang w:val="es-NI"/>
-        </w:rPr>
-        <w:t>—La señal de 9-E llegó hasta nosotros —dijo—. No las palabras. La frecuencia. Después vimos las luces de los distritos.</w:t>
-      </w:r>
-    </w:p>
-    <w:p>
-      <w:pPr>
-        <w:pStyle w:val="NovelBody"/>
-        <w:rPr>
-          <w:lang w:val="es-NI"/>
-        </w:rPr>
-      </w:pPr>
-      <w:r>
-        <w:rPr>
-          <w:lang w:val="es-NI"/>
-        </w:rPr>
-        <w:t xml:space="preserve">—¿Clancy está en </w:t>
-      </w:r>
+        <w:t>El Portador observó el dibujo.</w:t>
+      </w:r>
+    </w:p>
+    <w:p>
+      <w:pPr>
+        <w:pStyle w:val="NovelBody"/>
+        <w:rPr>
+          <w:lang w:val="es-NI"/>
+        </w:rPr>
+      </w:pPr>
+      <w:r>
+        <w:rPr>
+          <w:lang w:val="es-NI"/>
+        </w:rPr>
+        <w:t>—Los obispos usan rojo.</w:t>
+      </w:r>
+    </w:p>
+    <w:p>
+      <w:pPr>
+        <w:pStyle w:val="NovelBody"/>
+        <w:rPr>
+          <w:lang w:val="es-NI"/>
+        </w:rPr>
+      </w:pPr>
+      <w:r>
+        <w:rPr>
+          <w:lang w:val="es-NI"/>
+        </w:rPr>
+        <w:t>—Lo sabemos.</w:t>
+      </w:r>
+    </w:p>
+    <w:p>
+      <w:pPr>
+        <w:pStyle w:val="NovelBody"/>
+        <w:rPr>
+          <w:lang w:val="es-NI"/>
+        </w:rPr>
+      </w:pPr>
+      <w:r>
+        <w:rPr>
+          <w:lang w:val="es-NI"/>
+        </w:rPr>
+        <w:t>—Entonces él cambió el canal.</w:t>
+      </w:r>
+    </w:p>
+    <w:p>
+      <w:pPr>
+        <w:pStyle w:val="NovelBody"/>
+        <w:rPr>
+          <w:lang w:val="es-NI"/>
+        </w:rPr>
+      </w:pPr>
+      <w:r>
+        <w:rPr>
+          <w:lang w:val="es-NI"/>
+        </w:rPr>
+        <w:t>—O alguien lo hizo usando sus códigos —dijo James.</w:t>
+      </w:r>
+    </w:p>
+    <w:p>
+      <w:pPr>
+        <w:pStyle w:val="NovelBody"/>
+        <w:rPr>
+          <w:lang w:val="es-NI"/>
+        </w:rPr>
+      </w:pPr>
       <w:proofErr w:type="spellStart"/>
-      <w:r>
-        <w:rPr>
-          <w:lang w:val="es-NI"/>
-        </w:rPr>
-        <w:t>Voldsøy</w:t>
-      </w:r>
       <w:proofErr w:type="spellEnd"/>
       <w:r>
         <w:rPr>
           <w:lang w:val="es-NI"/>
         </w:rPr>
-        <w:t>? —preguntó Mara.</w:t>
-      </w:r>
-    </w:p>
-    <w:p>
-      <w:pPr>
-        <w:pStyle w:val="NovelBody"/>
-        <w:rPr>
-          <w:lang w:val="es-NI"/>
-        </w:rPr>
-      </w:pPr>
-      <w:r>
-        <w:rPr>
-          <w:lang w:val="es-NI"/>
-        </w:rPr>
-        <w:t xml:space="preserve">—No conozco el nombre del lugar con certeza. Sabemos que existe una isla al este y que algo desde allí alcanzó el cuerpo de </w:t>
-      </w:r>
-      <w:proofErr w:type="spellStart"/>
-      <w:r>
-        <w:rPr>
-          <w:lang w:val="es-NI"/>
-        </w:rPr>
-        <w:t>Keons</w:t>
-      </w:r>
-      <w:proofErr w:type="spellEnd"/>
-      <w:r>
-        <w:rPr>
-          <w:lang w:val="es-NI"/>
-        </w:rPr>
-        <w:t>.</w:t>
-      </w:r>
-    </w:p>
-    <w:p>
-      <w:pPr>
-        <w:pStyle w:val="NovelBody"/>
-        <w:rPr>
-          <w:lang w:val="es-NI"/>
-        </w:rPr>
-      </w:pPr>
-      <w:r>
-        <w:rPr>
-          <w:lang w:val="es-NI"/>
-        </w:rPr>
-        <w:t>—¿Algo o Clancy?</w:t>
-      </w:r>
-    </w:p>
-    <w:p>
-      <w:pPr>
-        <w:pStyle w:val="NovelBody"/>
-        <w:rPr>
-          <w:lang w:val="es-NI"/>
-        </w:rPr>
-      </w:pPr>
-      <w:r>
-        <w:rPr>
-          <w:lang w:val="es-NI"/>
-        </w:rPr>
-        <w:t>—La señal lleva su forma.</w:t>
-      </w:r>
-    </w:p>
-    <w:p>
-      <w:pPr>
-        <w:pStyle w:val="NovelBody"/>
-        <w:rPr>
-          <w:lang w:val="es-NI"/>
-        </w:rPr>
-      </w:pPr>
-      <w:r>
-        <w:rPr>
-          <w:lang w:val="es-NI"/>
-        </w:rPr>
-        <w:t>James desplegó un esquema del cadáver.</w:t>
-      </w:r>
-    </w:p>
-    <w:p>
-      <w:pPr>
-        <w:pStyle w:val="NovelBody"/>
-        <w:rPr>
-          <w:lang w:val="es-NI"/>
-        </w:rPr>
-      </w:pPr>
-      <w:r>
-        <w:rPr>
-          <w:lang w:val="es-NI"/>
-        </w:rPr>
-        <w:t>—Los ojos eran amarillos.</w:t>
-      </w:r>
-    </w:p>
-    <w:p>
-      <w:pPr>
-        <w:pStyle w:val="NovelBody"/>
-        <w:rPr>
-          <w:lang w:val="es-NI"/>
-        </w:rPr>
-      </w:pPr>
-      <w:proofErr w:type="spellStart"/>
-      <w:r>
-        <w:rPr>
-          <w:lang w:val="es-NI"/>
-        </w:rPr>
-        <w:t>Torchbearer</w:t>
-      </w:r>
-      <w:proofErr w:type="spellEnd"/>
-      <w:r>
-        <w:rPr>
-          <w:lang w:val="es-NI"/>
-        </w:rPr>
-        <w:t xml:space="preserve"> observó el dibujo.</w:t>
-      </w:r>
-    </w:p>
-    <w:p>
-      <w:pPr>
-        <w:pStyle w:val="NovelBody"/>
-        <w:rPr>
-          <w:lang w:val="es-NI"/>
-        </w:rPr>
-      </w:pPr>
-      <w:r>
-        <w:rPr>
-          <w:lang w:val="es-NI"/>
-        </w:rPr>
-        <w:t>—Los obispos usan rojo.</w:t>
-      </w:r>
-    </w:p>
-    <w:p>
-      <w:pPr>
-        <w:pStyle w:val="NovelBody"/>
-        <w:rPr>
-          <w:lang w:val="es-NI"/>
-        </w:rPr>
-      </w:pPr>
-      <w:r>
-        <w:rPr>
-          <w:lang w:val="es-NI"/>
-        </w:rPr>
-        <w:t>—Lo sabemos.</w:t>
-      </w:r>
-    </w:p>
-    <w:p>
-      <w:pPr>
-        <w:pStyle w:val="NovelBody"/>
-        <w:rPr>
-          <w:lang w:val="es-NI"/>
-        </w:rPr>
-      </w:pPr>
-      <w:r>
-        <w:rPr>
-          <w:lang w:val="es-NI"/>
-        </w:rPr>
-        <w:t>—Entonces él cambió el canal.</w:t>
-      </w:r>
-    </w:p>
-    <w:p>
-      <w:pPr>
-        <w:pStyle w:val="NovelBody"/>
-        <w:rPr>
-          <w:lang w:val="es-NI"/>
-        </w:rPr>
-      </w:pPr>
-      <w:r>
-        <w:rPr>
-          <w:lang w:val="es-NI"/>
-        </w:rPr>
-        <w:t>—O alguien lo hizo usando sus códigos —dijo James.</w:t>
-      </w:r>
-    </w:p>
-    <w:p>
-      <w:pPr>
-        <w:pStyle w:val="NovelBody"/>
-        <w:rPr>
-          <w:lang w:val="es-NI"/>
-        </w:rPr>
-      </w:pPr>
-      <w:proofErr w:type="spellStart"/>
-      <w:r>
-        <w:rPr>
-          <w:lang w:val="es-NI"/>
-        </w:rPr>
-        <w:t>Torchbearer</w:t>
-      </w:r>
-      <w:proofErr w:type="spellEnd"/>
-      <w:r>
-        <w:rPr>
-          <w:lang w:val="es-NI"/>
-        </w:rPr>
-        <w:t xml:space="preserve"> sonrió apenas.</w:t>
+        <w:t>El Portador sonrió apenas.</w:t>
       </w:r>
     </w:p>
     <w:p>
@@ -19017,18 +18798,12 @@
         </w:rPr>
       </w:pPr>
       <w:proofErr w:type="spellStart"/>
-      <w:r>
-        <w:rPr>
-          <w:lang w:val="es-NI"/>
-        </w:rPr>
-        <w:t>Torchbearer</w:t>
-      </w:r>
       <w:proofErr w:type="spellEnd"/>
       <w:r>
         <w:rPr>
           <w:lang w:val="es-NI"/>
         </w:rPr>
-        <w:t xml:space="preserve"> levantó la vista.</w:t>
+        <w:t>El Portador levantó la vista.</w:t>
       </w:r>
     </w:p>
     <w:p>
@@ -19137,18 +18912,12 @@
         </w:rPr>
       </w:pPr>
       <w:proofErr w:type="spellStart"/>
-      <w:r>
-        <w:rPr>
-          <w:lang w:val="es-NI"/>
-        </w:rPr>
-        <w:t>Torchbearer</w:t>
-      </w:r>
       <w:proofErr w:type="spellEnd"/>
       <w:r>
         <w:rPr>
           <w:lang w:val="es-NI"/>
         </w:rPr>
-        <w:t xml:space="preserve"> escuchó sin interrumpir.</w:t>
+        <w:t>El Portador escuchó sin interrumpir.</w:t>
       </w:r>
     </w:p>
     <w:p>
@@ -19300,18 +19069,12 @@
         </w:rPr>
       </w:pPr>
       <w:proofErr w:type="spellStart"/>
-      <w:r>
-        <w:rPr>
-          <w:lang w:val="es-NI"/>
-        </w:rPr>
-        <w:t>Torchbearer</w:t>
-      </w:r>
       <w:proofErr w:type="spellEnd"/>
       <w:r>
         <w:rPr>
           <w:lang w:val="es-NI"/>
         </w:rPr>
-        <w:t xml:space="preserve"> tardó en responder.</w:t>
+        <w:t>El Portador tardó en responder.</w:t>
       </w:r>
     </w:p>
     <w:p>
@@ -19392,18 +19155,12 @@
         </w:rPr>
       </w:pPr>
       <w:proofErr w:type="spellStart"/>
-      <w:r>
-        <w:rPr>
-          <w:lang w:val="es-NI"/>
-        </w:rPr>
-        <w:t>Torchbearer</w:t>
-      </w:r>
       <w:proofErr w:type="spellEnd"/>
       <w:r>
         <w:rPr>
           <w:lang w:val="es-NI"/>
         </w:rPr>
-        <w:t xml:space="preserve"> escuchó cada punto.</w:t>
+        <w:t>El Portador escuchó cada punto.</w:t>
       </w:r>
     </w:p>
     <w:p>
@@ -19470,18 +19227,12 @@
         </w:rPr>
       </w:pPr>
       <w:proofErr w:type="spellStart"/>
-      <w:r>
-        <w:rPr>
-          <w:lang w:val="es-NI"/>
-        </w:rPr>
-        <w:t>Torchbearer</w:t>
-      </w:r>
       <w:proofErr w:type="spellEnd"/>
       <w:r>
         <w:rPr>
           <w:lang w:val="es-NI"/>
         </w:rPr>
-        <w:t xml:space="preserve"> siguió la línea con el dedo.</w:t>
+        <w:t>El Portador siguió la línea con el dedo.</w:t>
       </w:r>
     </w:p>
     <w:p>
@@ -19661,18 +19412,12 @@
         </w:rPr>
       </w:pPr>
       <w:proofErr w:type="spellStart"/>
-      <w:r>
-        <w:rPr>
-          <w:lang w:val="es-NI"/>
-        </w:rPr>
-        <w:t>Torchbearer</w:t>
-      </w:r>
       <w:proofErr w:type="spellEnd"/>
       <w:r>
         <w:rPr>
           <w:lang w:val="es-NI"/>
         </w:rPr>
-        <w:t xml:space="preserve"> guardó la máscara.</w:t>
+        <w:t>El Portador guardó la máscara.</w:t>
       </w:r>
     </w:p>
     <w:p>
@@ -19724,25 +19469,13 @@
           <w:lang w:val="es-NI"/>
         </w:rPr>
       </w:pPr>
-      <w:r>
-        <w:rPr>
-          <w:lang w:val="es-NI"/>
-        </w:rPr>
-        <w:t xml:space="preserve">Mara entregó a </w:t>
-      </w:r>
       <w:proofErr w:type="spellStart"/>
-      <w:r>
-        <w:rPr>
-          <w:lang w:val="es-NI"/>
-        </w:rPr>
-        <w:t>Torchbearer</w:t>
-      </w:r>
       <w:proofErr w:type="spellEnd"/>
       <w:r>
         <w:rPr>
           <w:lang w:val="es-NI"/>
         </w:rPr>
-        <w:t xml:space="preserve"> una copia incompleta del mapa de la estatua y la lista de señales permitidas. Él dejó los mapas costeros y una pequeña pieza de metal marcada por Bram.</w:t>
+        <w:t>Mara entregó al Portador una copia incompleta del mapa de la estatua y la lista de señales permitidas. Él dejó los mapas costeros y una pequeña pieza de metal marcada por Bram.</w:t>
       </w:r>
     </w:p>
     <w:p>
@@ -19823,18 +19556,12 @@
         </w:rPr>
       </w:pPr>
       <w:proofErr w:type="spellStart"/>
-      <w:r>
-        <w:rPr>
-          <w:lang w:val="es-NI"/>
-        </w:rPr>
-        <w:t>Torchbearer</w:t>
-      </w:r>
       <w:proofErr w:type="spellEnd"/>
       <w:r>
         <w:rPr>
           <w:lang w:val="es-NI"/>
         </w:rPr>
-        <w:t xml:space="preserve"> descendió al agua.</w:t>
+        <w:t>El Portador descendió al agua.</w:t>
       </w:r>
     </w:p>
     <w:p>
@@ -19862,21 +19589,21 @@
         <w:rPr>
           <w:lang w:val="es-NI"/>
         </w:rPr>
-        <w:t>—¿Nunca estuviste en ese barco?</w:t>
-      </w:r>
-    </w:p>
-    <w:p>
-      <w:pPr>
-        <w:pStyle w:val="NovelBody"/>
-        <w:rPr>
-          <w:lang w:val="es-NI"/>
-        </w:rPr>
-      </w:pPr>
-      <w:r>
-        <w:rPr>
-          <w:lang w:val="es-NI"/>
-        </w:rPr>
-        <w:t>—Nunca.</w:t>
+        <w:t>—¿Afirmas que no estuviste en ese barco?</w:t>
+      </w:r>
+    </w:p>
+    <w:p>
+      <w:pPr>
+        <w:pStyle w:val="NovelBody"/>
+        <w:rPr>
+          <w:lang w:val="es-NI"/>
+        </w:rPr>
+      </w:pPr>
+      <w:r>
+        <w:rPr>
+          <w:lang w:val="es-NI"/>
+        </w:rPr>
+        <w:t>—Mi cuerpo no partió de Trench según todo lo que puedo verificar.</w:t>
       </w:r>
     </w:p>
     <w:p>
@@ -19905,7 +19632,7 @@
         <w:rPr>
           <w:lang w:val="es-NI"/>
         </w:rPr>
-        <w:t>—No salí de Trench durante todo el evento.</w:t>
+        <w:t>—No tengo memoria ni rastro material que me sitúe allí.</w:t>
       </w:r>
     </w:p>
     <w:p>
@@ -19930,32 +19657,26 @@
         </w:rPr>
       </w:pPr>
       <w:proofErr w:type="spellStart"/>
-      <w:r>
-        <w:rPr>
-          <w:lang w:val="es-NI"/>
-        </w:rPr>
-        <w:t>Torchbearer</w:t>
-      </w:r>
       <w:proofErr w:type="spellEnd"/>
       <w:r>
         <w:rPr>
           <w:lang w:val="es-NI"/>
         </w:rPr>
-        <w:t xml:space="preserve"> sostuvo su mirada.</w:t>
-      </w:r>
-    </w:p>
-    <w:p>
-      <w:pPr>
-        <w:pStyle w:val="NovelBody"/>
-        <w:rPr>
-          <w:lang w:val="es-NI"/>
-        </w:rPr>
-      </w:pPr>
-      <w:r>
-        <w:rPr>
-          <w:lang w:val="es-NI"/>
-        </w:rPr>
-        <w:t>—Era una dirección. Él le dio mi rostro.</w:t>
+        <w:t>El Portador sostuvo su mirada.</w:t>
+      </w:r>
+    </w:p>
+    <w:p>
+      <w:pPr>
+        <w:pStyle w:val="NovelBody"/>
+        <w:rPr>
+          <w:lang w:val="es-NI"/>
+        </w:rPr>
+      </w:pPr>
+      <w:r>
+        <w:rPr>
+          <w:lang w:val="es-NI"/>
+        </w:rPr>
+        <w:t>—No sé qué fue. Solo sé que mi rostro no basta para demostrar que era mi cuerpo.</w:t>
       </w:r>
     </w:p>
     <w:p>
@@ -20049,25 +19770,13 @@
           <w:lang w:val="es-NI"/>
         </w:rPr>
       </w:pPr>
-      <w:r>
-        <w:rPr>
-          <w:lang w:val="es-NI"/>
-        </w:rPr>
-        <w:t xml:space="preserve">Durante el camino, las pantallas mostraron una alerta sobre actividad Bandito en el perímetro. La imagen era borrosa y correspondía a una cámara del norte, donde </w:t>
-      </w:r>
       <w:proofErr w:type="spellStart"/>
-      <w:r>
-        <w:rPr>
-          <w:lang w:val="es-NI"/>
-        </w:rPr>
-        <w:t>Torchbearer</w:t>
-      </w:r>
       <w:proofErr w:type="spellEnd"/>
       <w:r>
         <w:rPr>
           <w:lang w:val="es-NI"/>
         </w:rPr>
-        <w:t xml:space="preserve"> nunca estuvo. No Chances había elegido el falso positivo más fácil de convertir en relato.</w:t>
+        <w:t>Durante el camino, las pantallas mostraron una alerta sobre actividad Bandito en el perímetro. La imagen era borrosa y correspondía a una cámara del norte, donde la ruta conocida del Portador no lo situaba. No Chances había elegido el falso positivo más fácil de convertir en relato.</w:t>
       </w:r>
     </w:p>
     <w:p>
@@ -20095,35 +19804,35 @@
         <w:rPr>
           <w:lang w:val="es-NI"/>
         </w:rPr>
-        <w:t>—Bram respondió —dijo.</w:t>
-      </w:r>
-    </w:p>
-    <w:p>
-      <w:pPr>
-        <w:pStyle w:val="NovelBody"/>
-        <w:rPr>
-          <w:lang w:val="es-NI"/>
-        </w:rPr>
-      </w:pPr>
-      <w:r>
-        <w:rPr>
-          <w:lang w:val="es-NI"/>
-        </w:rPr>
-        <w:t>—Eso sí lo sabemos.</w:t>
-      </w:r>
-    </w:p>
-    <w:p>
-      <w:pPr>
-        <w:pStyle w:val="NovelBody"/>
-        <w:rPr>
-          <w:lang w:val="es-NI"/>
-        </w:rPr>
-      </w:pPr>
-      <w:r>
-        <w:rPr>
-          <w:lang w:val="es-NI"/>
-        </w:rPr>
-        <w:t>—Probablemente abordó.</w:t>
+        <w:t>—El código de Bram respondió —dijo Mara.</w:t>
+      </w:r>
+    </w:p>
+    <w:p>
+      <w:pPr>
+        <w:pStyle w:val="NovelBody"/>
+        <w:rPr>
+          <w:lang w:val="es-NI"/>
+        </w:rPr>
+      </w:pPr>
+      <w:r>
+        <w:rPr>
+          <w:lang w:val="es-NI"/>
+        </w:rPr>
+        <w:t>—Eso es lo más firme que tenemos.</w:t>
+      </w:r>
+    </w:p>
+    <w:p>
+      <w:pPr>
+        <w:pStyle w:val="NovelBody"/>
+        <w:rPr>
+          <w:lang w:val="es-NI"/>
+        </w:rPr>
+      </w:pPr>
+      <w:r>
+        <w:rPr>
+          <w:lang w:val="es-NI"/>
+        </w:rPr>
+        <w:t>—Probablemente alguien que conocía sus códigos abordó.</w:t>
       </w:r>
     </w:p>
     <w:p>
@@ -20151,7 +19860,7 @@
         <w:rPr>
           <w:lang w:val="es-NI"/>
         </w:rPr>
-        <w:t>—Probablemente está preso.</w:t>
+        <w:t>—Probablemente esa persona está presa.</w:t>
       </w:r>
     </w:p>
     <w:p>
@@ -20176,25 +19885,13 @@
           <w:lang w:val="es-NI"/>
         </w:rPr>
       </w:pPr>
-      <w:r>
-        <w:rPr>
-          <w:lang w:val="es-NI"/>
-        </w:rPr>
-        <w:t xml:space="preserve">—Y </w:t>
-      </w:r>
       <w:proofErr w:type="spellStart"/>
-      <w:r>
-        <w:rPr>
-          <w:lang w:val="es-NI"/>
-        </w:rPr>
-        <w:t>Torchbearer</w:t>
-      </w:r>
       <w:proofErr w:type="spellEnd"/>
       <w:r>
         <w:rPr>
           <w:lang w:val="es-NI"/>
         </w:rPr>
-        <w:t xml:space="preserve"> nunca estuvo con Clancy.</w:t>
+        <w:t>—Y ninguna prueba coloca el cuerpo del Portador junto a Clancy.</w:t>
       </w:r>
     </w:p>
     <w:p>
@@ -20222,7 +19919,7 @@
         <w:rPr>
           <w:lang w:val="es-NI"/>
         </w:rPr>
-        <w:t>—Nunca estuvo físicamente.</w:t>
+        <w:t>—Ninguna prueba que tengamos.</w:t>
       </w:r>
     </w:p>
     <w:p>
@@ -20275,7 +19972,7 @@
         </w:rPr>
       </w:pPr>
       <w:r>
-        <w:t>—Cuando lo vea —dijo—, alguien tendrá que explicarle que todo lo que hizo después de separarse del técnico lo hizo con sus propias manos.</w:t>
+        <w:t>—Cuando lo vea —dijo—, primero tendrá que contar qué vio. Después intentaremos separar las manos, las voces y las rutas.</w:t>
       </w:r>
     </w:p>
     <w:p>
@@ -20317,7 +20014,7 @@
         <w:rPr>
           <w:lang w:val="es-NI"/>
         </w:rPr>
-        <w:t>La idea de haber estado solo podía sentirse como abandono. La idea de haber sobrevivido solo podía sentirse como fuerza. Ambas serían ciertas al mismo tiempo.</w:t>
+        <w:t>La idea de haber actuado sin ayuda física podía sentirse como abandono. La idea de haber sostenido al pasajero y alcanzado la costa con sus propias manos podía sentirse como fuerza. Ninguna interpretación estaba completa todavía.</w:t>
       </w:r>
     </w:p>
     <w:p>
@@ -20373,7 +20070,7 @@
         <w:rPr>
           <w:lang w:val="es-NI"/>
         </w:rPr>
-        <w:t>Por primera vez, Mara comprendió que una presencia podía ser verdadera sin ser un cuerpo.</w:t>
+        <w:t>Por primera vez, Mara aceptó que una experiencia podía ser verdadera para Clancy sin que ellos comprendieran todavía qué clase de presencia la había sostenido.</w:t>
       </w:r>
     </w:p>
     <w:p>
@@ -20639,39 +20336,15 @@
           <w:lang w:val="es-NI"/>
         </w:rPr>
       </w:pPr>
-      <w:r>
-        <w:rPr>
-          <w:lang w:val="es-NI"/>
-        </w:rPr>
-        <w:t xml:space="preserve">Mara observaba desde una escalera. Durante años habían pensado la resistencia como una sucesión de puertas que debían abrirse para Clancy. Ahora construían movimientos capaces de </w:t>
-      </w:r>
       <w:proofErr w:type="gramStart"/>
-      <w:r>
-        <w:rPr>
-          <w:lang w:val="es-NI"/>
-        </w:rPr>
-        <w:t>continuar</w:t>
-      </w:r>
       <w:proofErr w:type="gramEnd"/>
-      <w:r>
-        <w:rPr>
-          <w:lang w:val="es-NI"/>
-        </w:rPr>
-        <w:t xml:space="preserve"> aunque él no apareciera, aunque </w:t>
-      </w:r>
       <w:proofErr w:type="spellStart"/>
-      <w:r>
-        <w:rPr>
-          <w:lang w:val="es-NI"/>
-        </w:rPr>
-        <w:t>Torchbearer</w:t>
-      </w:r>
       <w:proofErr w:type="spellEnd"/>
       <w:r>
         <w:rPr>
           <w:lang w:val="es-NI"/>
         </w:rPr>
-        <w:t xml:space="preserve"> no cruzara el perímetro y aunque Mara o James faltaran.</w:t>
+        <w:t>Mara observaba desde una escalera. Durante años habían pensado la resistencia como una sucesión de puertas que debían abrirse para Clancy. Ahora construían movimientos capaces de continuar aunque él no apareciera, aunque el Portador no cruzara el perímetro y aunque Mara o James faltaran.</w:t>
       </w:r>
     </w:p>
     <w:p>
@@ -21646,25 +21319,13 @@
           <w:lang w:val="es-NI"/>
         </w:rPr>
       </w:pPr>
-      <w:r>
-        <w:rPr>
-          <w:lang w:val="es-NI"/>
-        </w:rPr>
-        <w:t>—</w:t>
-      </w:r>
       <w:proofErr w:type="spellStart"/>
-      <w:r>
-        <w:rPr>
-          <w:lang w:val="es-NI"/>
-        </w:rPr>
-        <w:t>Torchbearer</w:t>
-      </w:r>
       <w:proofErr w:type="spellEnd"/>
       <w:r>
         <w:rPr>
           <w:lang w:val="es-NI"/>
         </w:rPr>
-        <w:t xml:space="preserve"> cree que puede serlo.</w:t>
+        <w:t>—El Portador cree que puede serlo.</w:t>
       </w:r>
     </w:p>
     <w:p>
@@ -21828,26 +21489,13 @@
           <w:lang w:val="es-NI"/>
         </w:rPr>
       </w:pPr>
-      <w:r>
-        <w:rPr>
-          <w:lang w:val="es-NI"/>
-        </w:rPr>
-        <w:lastRenderedPageBreak/>
-        <w:t xml:space="preserve">La segunda reunión con </w:t>
-      </w:r>
       <w:proofErr w:type="spellStart"/>
-      <w:r>
-        <w:rPr>
-          <w:lang w:val="es-NI"/>
-        </w:rPr>
-        <w:t>Torchbearer</w:t>
-      </w:r>
       <w:proofErr w:type="spellEnd"/>
       <w:r>
         <w:rPr>
           <w:lang w:val="es-NI"/>
         </w:rPr>
-        <w:t xml:space="preserve"> ocurrió sin que entrara en Dema.</w:t>
+        <w:t>La segunda reunión con el Portador ocurrió sin que entrara en Dema.</w:t>
       </w:r>
     </w:p>
     <w:p>
@@ -21942,18 +21590,12 @@
         </w:rPr>
       </w:pPr>
       <w:proofErr w:type="spellStart"/>
-      <w:r>
-        <w:rPr>
-          <w:lang w:val="es-NI"/>
-        </w:rPr>
-        <w:t>Torchbearer</w:t>
-      </w:r>
       <w:proofErr w:type="spellEnd"/>
       <w:r>
         <w:rPr>
           <w:lang w:val="es-NI"/>
         </w:rPr>
-        <w:t xml:space="preserve"> no confirmó que el prisionero fuera él. Dema podía reutilizar números, colocar objetos y construir una trampa. La sospecha se volvió fuerte, no absoluta.</w:t>
+        <w:t>El Portador no confirmó que el prisionero fuera él. Dema podía reutilizar números, colocar objetos y construir una trampa. La sospecha se volvió fuerte, no absoluta.</w:t>
       </w:r>
     </w:p>
     <w:p>
@@ -22065,56 +21707,49 @@
         <w:rPr>
           <w:lang w:val="es-NI"/>
         </w:rPr>
-        <w:t>Las reglas para un huésped vivo ocuparon cuatro páginas.</w:t>
-      </w:r>
-    </w:p>
-    <w:p>
-      <w:pPr>
-        <w:pStyle w:val="NovelBody"/>
-        <w:rPr>
-          <w:lang w:val="es-NI"/>
-        </w:rPr>
-      </w:pPr>
-      <w:r>
-        <w:rPr>
-          <w:lang w:val="es-NI"/>
-        </w:rPr>
-        <w:t xml:space="preserve">Mara insistió en escribirlas a mano y guardar copias en tres células. Nadie sabía si Clancy podía volver a ocupar un cuerpo </w:t>
-      </w:r>
-      <w:r>
-        <w:rPr>
-          <w:lang w:val="es-NI"/>
-        </w:rPr>
-        <w:lastRenderedPageBreak/>
-        <w:t>vivo. Nadie sabía cuánto dolor producía, si la conciencia original permanecía despierta o si el vínculo podía cortarse.</w:t>
-      </w:r>
-    </w:p>
-    <w:p>
-      <w:pPr>
-        <w:pStyle w:val="NovelBody"/>
-        <w:rPr>
-          <w:lang w:val="es-NI"/>
-        </w:rPr>
-      </w:pPr>
-      <w:r>
-        <w:rPr>
-          <w:lang w:val="es-NI"/>
-        </w:rPr>
-        <w:t>Precisamente por eso necesitaban decidir antes de la urgencia.</w:t>
-      </w:r>
-    </w:p>
-    <w:p>
-      <w:pPr>
-        <w:pStyle w:val="NovelBody"/>
-        <w:rPr>
-          <w:lang w:val="es-NI"/>
-        </w:rPr>
-      </w:pPr>
-      <w:r>
-        <w:rPr>
-          <w:lang w:val="es-NI"/>
-        </w:rPr>
-        <w:t>La primera regla era simple:</w:t>
+        <w:t>El protocolo para la hipótesis de un huésped vivo ocupó cuatro páginas.</w:t>
+      </w:r>
+    </w:p>
+    <w:p>
+      <w:pPr>
+        <w:pStyle w:val="NovelBody"/>
+        <w:rPr>
+          <w:lang w:val="es-NI"/>
+        </w:rPr>
+      </w:pPr>
+      <w:r>
+        <w:rPr>
+          <w:lang w:val="es-NI"/>
+        </w:rPr>
+        <w:t>Mara escribió en la primera línea: POSIBILIDAD NO CONFIRMADA. Después guardó copias en tres células. Nadie sabía si Clancy podía ocupar un cuerpo vivo; tampoco sabían si esa posibilidad existía, cuánto dolor produciría, si la conciencia original permanecería despierta o si el vínculo podría cortarse.</w:t>
+      </w:r>
+    </w:p>
+    <w:p>
+      <w:pPr>
+        <w:pStyle w:val="NovelBody"/>
+        <w:rPr>
+          <w:lang w:val="es-NI"/>
+        </w:rPr>
+      </w:pPr>
+      <w:r>
+        <w:rPr>
+          <w:lang w:val="es-NI"/>
+        </w:rPr>
+        <w:t>Precisamente por eso querían fijar límites antes de que la urgencia convirtiera una suposición en permiso.</w:t>
+      </w:r>
+    </w:p>
+    <w:p>
+      <w:pPr>
+        <w:pStyle w:val="NovelBody"/>
+        <w:rPr>
+          <w:lang w:val="es-NI"/>
+        </w:rPr>
+      </w:pPr>
+      <w:r>
+        <w:rPr>
+          <w:lang w:val="es-NI"/>
+        </w:rPr>
+        <w:t>La primera condición provisional era simple:</w:t>
       </w:r>
     </w:p>
     <w:p>
@@ -22142,7 +21777,7 @@
         <w:rPr>
           <w:lang w:val="es-NI"/>
         </w:rPr>
-        <w:t>La segunda:</w:t>
+        <w:t>La segunda condición:</w:t>
       </w:r>
     </w:p>
     <w:p>
@@ -22170,7 +21805,7 @@
         <w:rPr>
           <w:lang w:val="es-NI"/>
         </w:rPr>
-        <w:t>La tercera exigía testigos.</w:t>
+        <w:t>La tercera condición exigía testigos.</w:t>
       </w:r>
     </w:p>
     <w:p>
@@ -22212,21 +21847,21 @@
         <w:rPr>
           <w:lang w:val="es-NI"/>
         </w:rPr>
-        <w:t>La sexta prohibía usar a alguien inconsciente como sustituto de una decisión.</w:t>
-      </w:r>
-    </w:p>
-    <w:p>
-      <w:pPr>
-        <w:pStyle w:val="NovelBody"/>
-        <w:rPr>
-          <w:lang w:val="es-NI"/>
-        </w:rPr>
-      </w:pPr>
-      <w:r>
-        <w:rPr>
-          <w:lang w:val="es-NI"/>
-        </w:rPr>
-        <w:t>La séptima establecía que Clancy no recibiría control sobre la red completa por ocupar un cuerpo dentro de Dema.</w:t>
+        <w:t>La sexta prohibía utilizar a alguien inconsciente como sustituto de una decisión.</w:t>
+      </w:r>
+    </w:p>
+    <w:p>
+      <w:pPr>
+        <w:pStyle w:val="NovelBody"/>
+        <w:rPr>
+          <w:lang w:val="es-NI"/>
+        </w:rPr>
+      </w:pPr>
+      <w:r>
+        <w:rPr>
+          <w:lang w:val="es-NI"/>
+        </w:rPr>
+        <w:t>La séptima establecía que, aun en aquel supuesto, Clancy no recibiría control sobre la red completa por ocupar un cuerpo dentro de Dema.</w:t>
       </w:r>
     </w:p>
     <w:p>
@@ -22363,39 +21998,27 @@
           <w:lang w:val="es-NI"/>
         </w:rPr>
       </w:pPr>
-      <w:r>
-        <w:rPr>
-          <w:lang w:val="es-NI"/>
-        </w:rPr>
-        <w:t xml:space="preserve">James añadió una señal de corte mecánica. Si el huésped la activaba, el sistema de relés cerraría la conexión </w:t>
-      </w:r>
       <w:proofErr w:type="gramStart"/>
-      <w:r>
-        <w:rPr>
-          <w:lang w:val="es-NI"/>
-        </w:rPr>
-        <w:t>exterior</w:t>
-      </w:r>
       <w:proofErr w:type="gramEnd"/>
       <w:r>
         <w:rPr>
           <w:lang w:val="es-NI"/>
         </w:rPr>
-        <w:t xml:space="preserve"> aunque Clancy intentara mantenerla.</w:t>
-      </w:r>
-    </w:p>
-    <w:p>
-      <w:pPr>
-        <w:pStyle w:val="NovelBody"/>
-        <w:rPr>
-          <w:lang w:val="es-NI"/>
-        </w:rPr>
-      </w:pPr>
-      <w:r>
-        <w:rPr>
-          <w:lang w:val="es-NI"/>
-        </w:rPr>
-        <w:t>—¿Funcionará? —preguntó Mara.</w:t>
+        <w:t>James añadió al protocolo una señal de corte mecánica. Si la persona voluntaria la activaba, el sistema de relés cerraría la conexión exterior aunque Clancy intentara mantenerla.</w:t>
+      </w:r>
+    </w:p>
+    <w:p>
+      <w:pPr>
+        <w:pStyle w:val="NovelBody"/>
+        <w:rPr>
+          <w:lang w:val="es-NI"/>
+        </w:rPr>
+      </w:pPr>
+      <w:r>
+        <w:rPr>
+          <w:lang w:val="es-NI"/>
+        </w:rPr>
+        <w:t>—¿Funcionaría si el vínculo fuera posible? —preguntó Mara.</w:t>
       </w:r>
     </w:p>
     <w:p>
@@ -23036,7 +22659,7 @@
         <w:pStyle w:val="NovelBody"/>
       </w:pPr>
       <w:r>
-        <w:t>Torchbearer estaba a mi derecha.</w:t>
+        <w:t>El Portador estaba a mi derecha.</w:t>
       </w:r>
     </w:p>
     <w:p>
@@ -23100,7 +22723,7 @@
         <w:pStyle w:val="NovelBody"/>
       </w:pPr>
       <w:r>
-        <w:t>Torchbearer miró a la criatura.</w:t>
+        <w:t>El Portador miró a la criatura.</w:t>
       </w:r>
     </w:p>
     <w:p>
@@ -23284,7 +22907,7 @@
         <w:pStyle w:val="NovelBody"/>
       </w:pPr>
       <w:r>
-        <w:t>Torchbearer miró hacia la ciudad.</w:t>
+        <w:t>El Portador miró hacia la ciudad.</w:t>
       </w:r>
     </w:p>
     <w:p>
@@ -23324,7 +22947,7 @@
         <w:pStyle w:val="NovelBody"/>
       </w:pPr>
       <w:r>
-        <w:t>Torchbearer se agachó junto a mí. Su mano pareció apoyarse sobre mi hombro.</w:t>
+        <w:t>El Portador se agachó junto a mí. Su mano pareció apoyarse sobre mi hombro.</w:t>
       </w:r>
     </w:p>
     <w:p>
@@ -23516,53 +23139,17 @@
           <w:lang w:val="es-NI"/>
         </w:rPr>
       </w:pPr>
-      <w:r>
-        <w:rPr>
-          <w:lang w:val="es-NI"/>
-        </w:rPr>
-        <w:t xml:space="preserve">Este bloque acompaña la Parte IV sin añadir acontecimientos posteriores a la coda de </w:t>
-      </w:r>
       <w:proofErr w:type="spellStart"/>
-      <w:r>
-        <w:rPr>
-          <w:lang w:val="es-NI"/>
-        </w:rPr>
-        <w:t>Voldsøy</w:t>
-      </w:r>
       <w:proofErr w:type="spellEnd"/>
-      <w:r>
-        <w:rPr>
-          <w:lang w:val="es-NI"/>
-        </w:rPr>
-        <w:t xml:space="preserve">. Distingue el canon audiovisual de las decisiones de continuidad propias de </w:t>
-      </w:r>
       <w:proofErr w:type="spellStart"/>
-      <w:r>
-        <w:rPr>
-          <w:lang w:val="es-NI"/>
-        </w:rPr>
-        <w:t>Sahlo</w:t>
-      </w:r>
       <w:proofErr w:type="spellEnd"/>
-      <w:r>
-        <w:rPr>
-          <w:lang w:val="es-NI"/>
-        </w:rPr>
-        <w:t xml:space="preserve"> </w:t>
-      </w:r>
       <w:proofErr w:type="spellStart"/>
-      <w:r>
-        <w:rPr>
-          <w:lang w:val="es-NI"/>
-        </w:rPr>
-        <w:t>Folina</w:t>
-      </w:r>
       <w:proofErr w:type="spellEnd"/>
       <w:r>
         <w:rPr>
           <w:lang w:val="es-NI"/>
         </w:rPr>
-        <w:t xml:space="preserve"> y documenta los términos que se vuelven esenciales para la Parte V.</w:t>
+        <w:t>Este bloque acompaña la Parte IV sin añadir acontecimientos posteriores a la coda de Voldsøy. Distingue el canon audiovisual de las decisiones de continuidad propias de Sahlo Folina y documenta únicamente términos cuya función ya apareció en este volumen.</w:t>
       </w:r>
     </w:p>
     <w:p>
@@ -23959,7 +23546,7 @@
           </w:tcPr>
           <w:p>
             <w:r>
-              <w:t>No Chances, torre 9-E, rutas de Mara y James, investigación del técnico de Port Vial, testimonio del pasajero y protocolos éticos para un huésped vivo.</w:t>
+              <w:t>No Chances, torre 9-E, rutas de Mara y James, investigación del técnico de Port Vial, testimonio del pasajero y protocolos éticos ante la hipótesis de un huésped vivo.</w:t>
             </w:r>
           </w:p>
         </w:tc>
@@ -24061,53 +23648,17 @@
           <w:lang w:val="es-NI"/>
         </w:rPr>
       </w:pPr>
+      <w:proofErr w:type="spellStart"/>
+      <w:proofErr w:type="spellEnd"/>
+      <w:proofErr w:type="spellStart"/>
+      <w:proofErr w:type="spellEnd"/>
       <w:r>
         <w:rPr>
           <w:b/>
           <w:sz w:val="21"/>
           <w:lang w:val="es-NI"/>
         </w:rPr>
-        <w:lastRenderedPageBreak/>
-        <w:t xml:space="preserve">Torre 9-E. [FANON] </w:t>
-      </w:r>
-      <w:r>
-        <w:rPr>
-          <w:sz w:val="21"/>
-          <w:lang w:val="es-NI"/>
-        </w:rPr>
-        <w:t xml:space="preserve">Torre secundaria donde Dema preserva el cadáver de Keons. Su aislamiento del consejo permite mostrar el efecto del </w:t>
-      </w:r>
-      <w:proofErr w:type="spellStart"/>
-      <w:r>
-        <w:rPr>
-          <w:sz w:val="21"/>
-          <w:lang w:val="es-NI"/>
-        </w:rPr>
-        <w:t>seizing</w:t>
-      </w:r>
-      <w:proofErr w:type="spellEnd"/>
-      <w:r>
-        <w:rPr>
-          <w:sz w:val="21"/>
-          <w:lang w:val="es-NI"/>
-        </w:rPr>
-        <w:t xml:space="preserve"> antes de explicar la causa en </w:t>
-      </w:r>
-      <w:proofErr w:type="spellStart"/>
-      <w:r>
-        <w:rPr>
-          <w:sz w:val="21"/>
-          <w:lang w:val="es-NI"/>
-        </w:rPr>
-        <w:t>Voldsøy</w:t>
-      </w:r>
-      <w:proofErr w:type="spellEnd"/>
-      <w:r>
-        <w:rPr>
-          <w:sz w:val="21"/>
-          <w:lang w:val="es-NI"/>
-        </w:rPr>
-        <w:t>.</w:t>
+        <w:t>Torre 9-E. [FANON] Torre secundaria donde Dema preserva el cadáver de Keons. Su aislamiento permite que Mara y James observen una ocupación remota cuya mecánica todavía no comprenden.</w:t>
       </w:r>
     </w:p>
     <w:p>
@@ -24121,7 +23672,7 @@
       <w:proofErr w:type="spellStart"/>
       <w:proofErr w:type="spellEnd"/>
       <w:r>
-        <w:t>Presencia orientadora. [SEMI-CANON COMPATIBLE] Clancy percibe una dirección asociada a Torchbearer aun cuando los testimonios físicos no coinciden. Este volumen establece sus límites materiales, pero reserva la explicación completa de su naturaleza para la continuidad posterior.</w:t>
+        <w:t>Presencia orientadora. [SEMI-CANON COMPATIBLE] Clancy atribuye una dirección al Portador aun cuando los testimonios y rastros físicos no coinciden. Este volumen muestra anomalías materiales, pero no confirma si se trata de percepción, vínculo, memoria, guía o un fenómeno distinto.</w:t>
       </w:r>
     </w:p>
     <w:p>
@@ -24133,7 +23684,7 @@
         </w:rPr>
       </w:pPr>
       <w:r>
-        <w:t>Bram. [FANON] Es el mismo cartógrafo y enlace Bandito establecido en las Partes I y II. Su conocimiento de rutas y códigos lo convierte en una hipótesis fuerte alrededor de Port Vial, pero su participación exacta y su identidad como prisionero no quedan confirmadas en esta parte.</w:t>
+        <w:t>Bram. [FANON] Es el cartógrafo y enlace Bandito establecido en las Partes I y II. Sus códigos y rutas aparecen relacionados con Port Vial, pero este volumen no confirma que fuera el técnico ni que el prisionero de No Chances sea él.</w:t>
       </w:r>
     </w:p>
     <w:p>
@@ -24145,7 +23696,7 @@
         </w:rPr>
       </w:pPr>
       <w:r>
-        <w:t>Pasajero recuperado. [FANON] Hombre rescatado físicamente por Clancy y recuperado después por No Chances. Su testimonio confirma que Clancy llegó vivo a una costa y hablaba hacia un lugar donde no había un segundo cuerpo visible, sin resolver la identidad del técnico anterior al impacto.</w:t>
+        <w:t>Pasajero recuperado. [FANON] Hombre rescatado físicamente por Clancy y localizado después por No Chances en una cala de roca negra, junto al panel, agua y una lona. Su testimonio confirma que Clancy alcanzó vivo la costa y hablaba hacia un lugar donde no había un segundo cuerpo visible.</w:t>
       </w:r>
     </w:p>
     <w:p>
@@ -24236,36 +23787,15 @@
           <w:lang w:val="es-NI"/>
         </w:rPr>
       </w:pPr>
+      <w:proofErr w:type="spellStart"/>
+      <w:proofErr w:type="spellEnd"/>
       <w:r>
         <w:rPr>
           <w:b/>
           <w:sz w:val="21"/>
           <w:lang w:val="es-NI"/>
         </w:rPr>
-        <w:t xml:space="preserve">Huésped vivo. [FANON ÉTICO] </w:t>
-      </w:r>
-      <w:r>
-        <w:rPr>
-          <w:sz w:val="21"/>
-          <w:lang w:val="es-NI"/>
-        </w:rPr>
-        <w:t xml:space="preserve">Posible persona que permite el </w:t>
-      </w:r>
-      <w:proofErr w:type="spellStart"/>
-      <w:r>
-        <w:rPr>
-          <w:sz w:val="21"/>
-          <w:lang w:val="es-NI"/>
-        </w:rPr>
-        <w:t>seizing</w:t>
-      </w:r>
-      <w:proofErr w:type="spellEnd"/>
-      <w:r>
-        <w:rPr>
-          <w:sz w:val="21"/>
-          <w:lang w:val="es-NI"/>
-        </w:rPr>
-        <w:t xml:space="preserve"> con consentimiento. La red fija límites, señal de corte, testigos y cuidado posterior antes de intentar cualquier contacto.</w:t>
+        <w:t>Hipótesis interna del huésped vivo. [HIPÓTESIS DE LA RED] Protocolo ético creado por Mara y James antes de conocer el límite real del seizing. No constituye una capacidad confirmada ni una regla del mundo.</w:t>
       </w:r>
     </w:p>
     <w:p>
@@ -24614,32 +24144,14 @@
         </w:rPr>
       </w:pPr>
       <w:proofErr w:type="spellStart"/>
-      <w:r>
-        <w:rPr>
-          <w:lang w:val="es-NI"/>
-        </w:rPr>
-        <w:t>Sahlo</w:t>
-      </w:r>
       <w:proofErr w:type="spellEnd"/>
-      <w:r>
-        <w:rPr>
-          <w:lang w:val="es-NI"/>
-        </w:rPr>
-        <w:t xml:space="preserve"> </w:t>
-      </w:r>
       <w:proofErr w:type="spellStart"/>
-      <w:r>
-        <w:rPr>
-          <w:lang w:val="es-NI"/>
-        </w:rPr>
-        <w:t>Folina</w:t>
-      </w:r>
       <w:proofErr w:type="spellEnd"/>
       <w:r>
         <w:rPr>
           <w:lang w:val="es-NI"/>
         </w:rPr>
-        <w:t>: Parte III - edición editorial consolidada.</w:t>
+        <w:t>Sahlo Folina: Parte III — edición final canónica.</w:t>
       </w:r>
     </w:p>
     <w:p>
@@ -24652,32 +24164,14 @@
         </w:rPr>
       </w:pPr>
       <w:proofErr w:type="spellStart"/>
-      <w:r>
-        <w:rPr>
-          <w:lang w:val="es-NI"/>
-        </w:rPr>
-        <w:t>Sahlo</w:t>
-      </w:r>
       <w:proofErr w:type="spellEnd"/>
-      <w:r>
-        <w:rPr>
-          <w:lang w:val="es-NI"/>
-        </w:rPr>
-        <w:t xml:space="preserve"> </w:t>
-      </w:r>
       <w:proofErr w:type="spellStart"/>
-      <w:r>
-        <w:rPr>
-          <w:lang w:val="es-NI"/>
-        </w:rPr>
-        <w:t>Folina</w:t>
-      </w:r>
       <w:proofErr w:type="spellEnd"/>
       <w:r>
         <w:rPr>
           <w:lang w:val="es-NI"/>
         </w:rPr>
-        <w:t>: Biblia de continuidad de las Partes IV y V, edición v3.1.</w:t>
+        <w:t>Mapa de revelaciones y presagios de Sahlo Folina, versión 1.</w:t>
       </w:r>
     </w:p>
     <w:p>
@@ -24822,28 +24316,13 @@
           <w:lang w:val="es-NI"/>
         </w:rPr>
       </w:pPr>
-      <w:r>
-        <w:rPr>
-          <w:lang w:val="es-NI"/>
-        </w:rPr>
-        <w:t>La Parte IV concluye con una resistencia interior autónoma, un posible prisionero ligado a Saturday y un contacto procedente de Voldsøy. No incluye una carta nueva de Clancy. La Parte V comenzará en la isla y reconstruirá las causas de lo observado dentro de Dema.</w:t>
-      </w:r>
       <w:proofErr w:type="spellStart"/>
-      <w:r>
-        <w:rPr>
-          <w:lang w:val="es-NI"/>
-        </w:rPr>
-      </w:r>
       <w:proofErr w:type="spellEnd"/>
       <w:r>
         <w:rPr>
           <w:lang w:val="es-NI"/>
         </w:rPr>
-      </w:r>
-      <w:r>
-        <w:rPr>
-          <w:lang w:val="es-NI"/>
-        </w:rPr>
+        <w:t>La Parte IV concluye con una resistencia interior autónoma, un posible prisionero ligado a Saturday y un segundo contacto procedente de Voldsøy. No incluye una carta nueva de Clancy. La Parte V comenzará en la isla y revelará las causas completas de los rastros que Dema solo pudo observar.</w:t>
       </w:r>
     </w:p>
     <w:sectPr>

</xml_diff>